<commit_message>
Initial commit with stylized Streamlit dashboard
</commit_message>
<xml_diff>
--- a/docs/Final Report.docx
+++ b/docs/Final Report.docx
@@ -1,6 +1,6 @@
 
 <file path=word/document.xml><?xml version="1.0" encoding="utf-8"?>
-<w:document xmlns:wpc="http://schemas.microsoft.com/office/word/2010/wordprocessingCanvas" xmlns:cx="http://schemas.microsoft.com/office/drawing/2014/chartex" xmlns:cx1="http://schemas.microsoft.com/office/drawing/2015/9/8/chartex" xmlns:cx2="http://schemas.microsoft.com/office/drawing/2015/10/21/chartex" xmlns:cx3="http://schemas.microsoft.com/office/drawing/2016/5/9/chartex" xmlns:cx4="http://schemas.microsoft.com/office/drawing/2016/5/10/chartex" xmlns:cx5="http://schemas.microsoft.com/office/drawing/2016/5/11/chartex" xmlns:cx6="http://schemas.microsoft.com/office/drawing/2016/5/12/chartex" xmlns:cx7="http://schemas.microsoft.com/office/drawing/2016/5/13/chartex" xmlns:cx8="http://schemas.microsoft.com/office/drawing/2016/5/14/chartex" xmlns:mc="http://schemas.openxmlformats.org/markup-compatibility/2006" xmlns:aink="http://schemas.microsoft.com/office/drawing/2016/ink" xmlns:am3d="http://schemas.microsoft.com/office/drawing/2017/model3d" xmlns:o="urn:schemas-microsoft-com:office:office" xmlns:oel="http://schemas.microsoft.com/office/2019/extlst" xmlns:r="http://schemas.openxmlformats.org/officeDocument/2006/relationships" xmlns:m="http://schemas.openxmlformats.org/officeDocument/2006/math" xmlns:v="urn:schemas-microsoft-com:vml" xmlns:wp14="http://schemas.microsoft.com/office/word/2010/wordprocessingDrawing" xmlns:wp="http://schemas.openxmlformats.org/drawingml/2006/wordprocessingDrawing" xmlns:w10="urn:schemas-microsoft-com:office:word" xmlns:w="http://schemas.openxmlformats.org/wordprocessingml/2006/main" xmlns:w14="http://schemas.microsoft.com/office/word/2010/wordml" xmlns:w15="http://schemas.microsoft.com/office/word/2012/wordml" xmlns:w16cex="http://schemas.microsoft.com/office/word/2018/wordml/cex" xmlns:w16cid="http://schemas.microsoft.com/office/word/2016/wordml/cid" xmlns:w16="http://schemas.microsoft.com/office/word/2018/wordml" xmlns:w16du="http://schemas.microsoft.com/office/word/2023/wordml/word16du" xmlns:w16sdtdh="http://schemas.microsoft.com/office/word/2020/wordml/sdtdatahash" xmlns:w16sdtfl="http://schemas.microsoft.com/office/word/2024/wordml/sdtformatlock" xmlns:w16se="http://schemas.microsoft.com/office/word/2015/wordml/symex" xmlns:wpg="http://schemas.microsoft.com/office/word/2010/wordprocessingGroup" xmlns:wpi="http://schemas.microsoft.com/office/word/2010/wordprocessingInk" xmlns:wne="http://schemas.microsoft.com/office/word/2006/wordml" xmlns:wps="http://schemas.microsoft.com/office/word/2010/wordprocessingShape" mc:Ignorable="w14 w15 w16se w16cid w16 w16cex w16sdtdh w16sdtfl w16du wp14">
+<w:document xmlns:wpc="http://schemas.microsoft.com/office/word/2010/wordprocessingCanvas" xmlns:cx="http://schemas.microsoft.com/office/drawing/2014/chartex" xmlns:cx1="http://schemas.microsoft.com/office/drawing/2015/9/8/chartex" xmlns:cx2="http://schemas.microsoft.com/office/drawing/2015/10/21/chartex" xmlns:cx3="http://schemas.microsoft.com/office/drawing/2016/5/9/chartex" xmlns:cx4="http://schemas.microsoft.com/office/drawing/2016/5/10/chartex" xmlns:cx5="http://schemas.microsoft.com/office/drawing/2016/5/11/chartex" xmlns:cx6="http://schemas.microsoft.com/office/drawing/2016/5/12/chartex" xmlns:cx7="http://schemas.microsoft.com/office/drawing/2016/5/13/chartex" xmlns:cx8="http://schemas.microsoft.com/office/drawing/2016/5/14/chartex" xmlns:mc="http://schemas.openxmlformats.org/markup-compatibility/2006" xmlns:aink="http://schemas.microsoft.com/office/drawing/2016/ink" xmlns:am3d="http://schemas.microsoft.com/office/drawing/2017/model3d" xmlns:o="urn:schemas-microsoft-com:office:office" xmlns:r="http://schemas.openxmlformats.org/officeDocument/2006/relationships" xmlns:m="http://schemas.openxmlformats.org/officeDocument/2006/math" xmlns:v="urn:schemas-microsoft-com:vml" xmlns:wp14="http://schemas.microsoft.com/office/word/2010/wordprocessingDrawing" xmlns:wp="http://schemas.openxmlformats.org/drawingml/2006/wordprocessingDrawing" xmlns:w10="urn:schemas-microsoft-com:office:word" xmlns:w="http://schemas.openxmlformats.org/wordprocessingml/2006/main" xmlns:w14="http://schemas.microsoft.com/office/word/2010/wordml" xmlns:w15="http://schemas.microsoft.com/office/word/2012/wordml" xmlns:w16cex="http://schemas.microsoft.com/office/word/2018/wordml/cex" xmlns:w16cid="http://schemas.microsoft.com/office/word/2016/wordml/cid" xmlns:w16="http://schemas.microsoft.com/office/word/2018/wordml" xmlns:w16sdtdh="http://schemas.microsoft.com/office/word/2020/wordml/sdtdatahash" xmlns:w16se="http://schemas.microsoft.com/office/word/2015/wordml/symex" xmlns:wpg="http://schemas.microsoft.com/office/word/2010/wordprocessingGroup" xmlns:wpi="http://schemas.microsoft.com/office/word/2010/wordprocessingInk" xmlns:wne="http://schemas.microsoft.com/office/word/2006/wordml" xmlns:wps="http://schemas.microsoft.com/office/word/2010/wordprocessingShape" mc:Ignorable="w14 w15 w16se w16cid w16 w16cex w16sdtdh wp14">
   <w:body>
     <w:p>
       <w:pPr>
@@ -1069,23 +1069,13 @@
               </w:rPr>
               <w:t>11</w:t>
             </w:r>
-          </w:p>
-          <w:p>
-            <w:pPr>
-              <w:jc w:val="center"/>
-              <w:rPr>
-                <w:sz w:val="30"/>
-                <w:szCs w:val="30"/>
-                <w:lang w:val="en-US"/>
-              </w:rPr>
-            </w:pPr>
             <w:r>
               <w:rPr>
                 <w:sz w:val="30"/>
                 <w:szCs w:val="30"/>
                 <w:lang w:val="en-US"/>
               </w:rPr>
-              <w:t>11</w:t>
+              <w:t>-12</w:t>
             </w:r>
           </w:p>
           <w:p>
@@ -1103,7 +1093,57 @@
                 <w:szCs w:val="30"/>
                 <w:lang w:val="en-US"/>
               </w:rPr>
-              <w:t>11-12</w:t>
+              <w:t>1</w:t>
+            </w:r>
+            <w:r>
+              <w:rPr>
+                <w:sz w:val="30"/>
+                <w:szCs w:val="30"/>
+                <w:lang w:val="en-US"/>
+              </w:rPr>
+              <w:t>2</w:t>
+            </w:r>
+          </w:p>
+          <w:p>
+            <w:pPr>
+              <w:jc w:val="center"/>
+              <w:rPr>
+                <w:sz w:val="30"/>
+                <w:szCs w:val="30"/>
+                <w:lang w:val="en-US"/>
+              </w:rPr>
+            </w:pPr>
+            <w:r>
+              <w:rPr>
+                <w:sz w:val="30"/>
+                <w:szCs w:val="30"/>
+                <w:lang w:val="en-US"/>
+              </w:rPr>
+              <w:t>1</w:t>
+            </w:r>
+            <w:r>
+              <w:rPr>
+                <w:sz w:val="30"/>
+                <w:szCs w:val="30"/>
+                <w:lang w:val="en-US"/>
+              </w:rPr>
+              <w:t>2</w:t>
+            </w:r>
+            <w:r>
+              <w:rPr>
+                <w:sz w:val="30"/>
+                <w:szCs w:val="30"/>
+                <w:lang w:val="en-US"/>
+              </w:rPr>
+              <w:t>-1</w:t>
+            </w:r>
+            <w:r>
+              <w:rPr>
+                <w:sz w:val="30"/>
+                <w:szCs w:val="30"/>
+                <w:lang w:val="en-US"/>
+              </w:rPr>
+              <w:t>3</w:t>
             </w:r>
           </w:p>
         </w:tc>
@@ -1160,7 +1200,31 @@
                 <w:szCs w:val="30"/>
                 <w:lang w:val="en-US"/>
               </w:rPr>
-              <w:t>13-15</w:t>
+              <w:t>1</w:t>
+            </w:r>
+            <w:r>
+              <w:rPr>
+                <w:sz w:val="30"/>
+                <w:szCs w:val="30"/>
+                <w:lang w:val="en-US"/>
+              </w:rPr>
+              <w:t>4</w:t>
+            </w:r>
+            <w:r>
+              <w:rPr>
+                <w:sz w:val="30"/>
+                <w:szCs w:val="30"/>
+                <w:lang w:val="en-US"/>
+              </w:rPr>
+              <w:t>-1</w:t>
+            </w:r>
+            <w:r>
+              <w:rPr>
+                <w:sz w:val="30"/>
+                <w:szCs w:val="30"/>
+                <w:lang w:val="en-US"/>
+              </w:rPr>
+              <w:t>6</w:t>
             </w:r>
           </w:p>
         </w:tc>
@@ -1218,7 +1282,15 @@
                 <w:szCs w:val="30"/>
                 <w:lang w:val="en-US"/>
               </w:rPr>
-              <w:t>16</w:t>
+              <w:t>1</w:t>
+            </w:r>
+            <w:r>
+              <w:rPr>
+                <w:sz w:val="30"/>
+                <w:szCs w:val="30"/>
+                <w:lang w:val="en-US"/>
+              </w:rPr>
+              <w:t>7</w:t>
             </w:r>
           </w:p>
         </w:tc>
@@ -1275,7 +1347,15 @@
                 <w:szCs w:val="30"/>
                 <w:lang w:val="en-US"/>
               </w:rPr>
-              <w:t>17</w:t>
+              <w:t>1</w:t>
+            </w:r>
+            <w:r>
+              <w:rPr>
+                <w:sz w:val="30"/>
+                <w:szCs w:val="30"/>
+                <w:lang w:val="en-US"/>
+              </w:rPr>
+              <w:t>8</w:t>
             </w:r>
           </w:p>
         </w:tc>
@@ -1330,7 +1410,15 @@
                 <w:szCs w:val="30"/>
                 <w:lang w:val="en-US"/>
               </w:rPr>
-              <w:t>18</w:t>
+              <w:t>1</w:t>
+            </w:r>
+            <w:r>
+              <w:rPr>
+                <w:sz w:val="30"/>
+                <w:szCs w:val="30"/>
+                <w:lang w:val="en-US"/>
+              </w:rPr>
+              <w:t>9</w:t>
             </w:r>
           </w:p>
         </w:tc>
@@ -1395,7 +1483,23 @@
                 <w:szCs w:val="30"/>
                 <w:lang w:val="en-US"/>
               </w:rPr>
-              <w:t>19-20</w:t>
+              <w:t>20</w:t>
+            </w:r>
+            <w:r>
+              <w:rPr>
+                <w:sz w:val="30"/>
+                <w:szCs w:val="30"/>
+                <w:lang w:val="en-US"/>
+              </w:rPr>
+              <w:t>-2</w:t>
+            </w:r>
+            <w:r>
+              <w:rPr>
+                <w:sz w:val="30"/>
+                <w:szCs w:val="30"/>
+                <w:lang w:val="en-US"/>
+              </w:rPr>
+              <w:t>1</w:t>
             </w:r>
           </w:p>
         </w:tc>
@@ -2390,25 +2494,7 @@
           <w:sz w:val="30"/>
           <w:szCs w:val="30"/>
         </w:rPr>
-        <w:t xml:space="preserve">RAM: Minimum 8 GB for smooth </w:t>
-      </w:r>
-      <w:proofErr w:type="gramStart"/>
-      <w:r>
-        <w:rPr>
-          <w:rFonts w:ascii="Arial" w:hAnsi="Arial" w:cs="Arial"/>
-          <w:sz w:val="30"/>
-          <w:szCs w:val="30"/>
-        </w:rPr>
-        <w:t>Pandas</w:t>
-      </w:r>
-      <w:proofErr w:type="gramEnd"/>
-      <w:r>
-        <w:rPr>
-          <w:rFonts w:ascii="Arial" w:hAnsi="Arial" w:cs="Arial"/>
-          <w:sz w:val="30"/>
-          <w:szCs w:val="30"/>
-        </w:rPr>
-        <w:t xml:space="preserve"> operations.</w:t>
+        <w:t>RAM: Minimum 8 GB for smooth Pandas operations.</w:t>
       </w:r>
     </w:p>
     <w:p>
@@ -4311,33 +4397,10 @@
     </w:p>
     <w:p>
       <w:pPr>
-        <w:pStyle w:val="ListParagraph"/>
+        <w:pStyle w:val="NormalWeb"/>
         <w:numPr>
           <w:ilvl w:val="0"/>
-          <w:numId w:val="20"/>
-        </w:numPr>
-        <w:ind w:left="1800"/>
-        <w:rPr>
-          <w:rFonts w:ascii="Arial" w:hAnsi="Arial" w:cs="Arial"/>
-          <w:sz w:val="30"/>
-          <w:szCs w:val="30"/>
-        </w:rPr>
-      </w:pPr>
-      <w:r>
-        <w:rPr>
-          <w:rFonts w:ascii="Arial" w:hAnsi="Arial" w:cs="Arial"/>
-          <w:sz w:val="30"/>
-          <w:szCs w:val="30"/>
-        </w:rPr>
-        <w:t>Current version → CLI + Matplotlib plots.</w:t>
-      </w:r>
-    </w:p>
-    <w:p>
-      <w:pPr>
-        <w:pStyle w:val="ListParagraph"/>
-        <w:numPr>
-          <w:ilvl w:val="0"/>
-          <w:numId w:val="23"/>
+          <w:numId w:val="39"/>
         </w:numPr>
         <w:tabs>
           <w:tab w:val="clear" w:pos="720"/>
@@ -4352,18 +4415,20 @@
       </w:pPr>
       <w:r>
         <w:rPr>
-          <w:rFonts w:ascii="Arial" w:hAnsi="Arial" w:cs="Arial"/>
-          <w:sz w:val="30"/>
-          <w:szCs w:val="30"/>
-        </w:rPr>
-        <w:t>Future GUI →</w:t>
-      </w:r>
-    </w:p>
-    <w:p>
-      <w:pPr>
+          <w:rStyle w:val="Strong"/>
+          <w:rFonts w:ascii="Arial" w:eastAsiaTheme="majorEastAsia" w:hAnsi="Arial" w:cs="Arial"/>
+          <w:sz w:val="30"/>
+          <w:szCs w:val="30"/>
+        </w:rPr>
+        <w:t>Dataset Preview Section</w:t>
+      </w:r>
+    </w:p>
+    <w:p>
+      <w:pPr>
+        <w:pStyle w:val="NormalWeb"/>
         <w:numPr>
           <w:ilvl w:val="0"/>
-          <w:numId w:val="24"/>
+          <w:numId w:val="43"/>
         </w:numPr>
         <w:ind w:left="2520"/>
         <w:rPr>
@@ -4378,14 +4443,24 @@
           <w:sz w:val="30"/>
           <w:szCs w:val="30"/>
         </w:rPr>
-        <w:t>File upload option for datasets.</w:t>
-      </w:r>
-    </w:p>
-    <w:p>
-      <w:pPr>
+        <w:t xml:space="preserve">Label: </w:t>
+      </w:r>
+      <w:r>
+        <w:rPr>
+          <w:rStyle w:val="Emphasis"/>
+          <w:rFonts w:ascii="Arial" w:eastAsiaTheme="majorEastAsia" w:hAnsi="Arial" w:cs="Arial"/>
+          <w:sz w:val="30"/>
+          <w:szCs w:val="30"/>
+        </w:rPr>
+        <w:t>“Dataset Preview (Scrollable)”</w:t>
+      </w:r>
+    </w:p>
+    <w:p>
+      <w:pPr>
+        <w:pStyle w:val="NormalWeb"/>
         <w:numPr>
           <w:ilvl w:val="0"/>
-          <w:numId w:val="24"/>
+          <w:numId w:val="43"/>
         </w:numPr>
         <w:ind w:left="2520"/>
         <w:rPr>
@@ -4400,14 +4475,32 @@
           <w:sz w:val="30"/>
           <w:szCs w:val="30"/>
         </w:rPr>
-        <w:t>Interactive anomaly visualization.</w:t>
-      </w:r>
-    </w:p>
-    <w:p>
-      <w:pPr>
+        <w:t xml:space="preserve">Shows the first </w:t>
+      </w:r>
+      <w:r>
+        <w:rPr>
+          <w:rStyle w:val="Strong"/>
+          <w:rFonts w:ascii="Arial" w:eastAsiaTheme="majorEastAsia" w:hAnsi="Arial" w:cs="Arial"/>
+          <w:sz w:val="30"/>
+          <w:szCs w:val="30"/>
+        </w:rPr>
+        <w:t>50 rows</w:t>
+      </w:r>
+      <w:r>
+        <w:rPr>
+          <w:rFonts w:ascii="Arial" w:hAnsi="Arial" w:cs="Arial"/>
+          <w:sz w:val="30"/>
+          <w:szCs w:val="30"/>
+        </w:rPr>
+        <w:t xml:space="preserve"> of the dataset.</w:t>
+      </w:r>
+    </w:p>
+    <w:p>
+      <w:pPr>
+        <w:pStyle w:val="NormalWeb"/>
         <w:numPr>
           <w:ilvl w:val="0"/>
-          <w:numId w:val="24"/>
+          <w:numId w:val="43"/>
         </w:numPr>
         <w:ind w:left="2520"/>
         <w:rPr>
@@ -4422,14 +4515,15 @@
           <w:sz w:val="30"/>
           <w:szCs w:val="30"/>
         </w:rPr>
-        <w:t>Export options (CSV, Excel, JSON).</w:t>
-      </w:r>
-    </w:p>
-    <w:p>
-      <w:pPr>
+        <w:t>Fixed height (~300px) so the table doesn’t expand over the whole page.</w:t>
+      </w:r>
+    </w:p>
+    <w:p>
+      <w:pPr>
+        <w:pStyle w:val="NormalWeb"/>
         <w:numPr>
           <w:ilvl w:val="0"/>
-          <w:numId w:val="24"/>
+          <w:numId w:val="43"/>
         </w:numPr>
         <w:ind w:left="2520"/>
         <w:rPr>
@@ -4444,7 +4538,663 @@
           <w:sz w:val="30"/>
           <w:szCs w:val="30"/>
         </w:rPr>
-        <w:t>Threshold adjustment slider for anomaly sensitivity.</w:t>
+        <w:t>Vertical scroll bar appears inside the table when hovering, allowing smooth scrolling.</w:t>
+      </w:r>
+    </w:p>
+    <w:p>
+      <w:pPr>
+        <w:pStyle w:val="NormalWeb"/>
+        <w:numPr>
+          <w:ilvl w:val="0"/>
+          <w:numId w:val="43"/>
+        </w:numPr>
+        <w:ind w:left="2520"/>
+        <w:rPr>
+          <w:rFonts w:ascii="Arial" w:hAnsi="Arial" w:cs="Arial"/>
+          <w:sz w:val="30"/>
+          <w:szCs w:val="30"/>
+        </w:rPr>
+      </w:pPr>
+      <w:r>
+        <w:rPr>
+          <w:rFonts w:ascii="Arial" w:hAnsi="Arial" w:cs="Arial"/>
+          <w:sz w:val="30"/>
+          <w:szCs w:val="30"/>
+        </w:rPr>
+        <w:t>Columns include: Transaction_ID, Customer_ID, State, Age, Shop_Category, Sales, z_score, is_anomaly.</w:t>
+      </w:r>
+    </w:p>
+    <w:p>
+      <w:pPr>
+        <w:pStyle w:val="NormalWeb"/>
+        <w:numPr>
+          <w:ilvl w:val="0"/>
+          <w:numId w:val="40"/>
+        </w:numPr>
+        <w:tabs>
+          <w:tab w:val="clear" w:pos="720"/>
+          <w:tab w:val="num" w:pos="1800"/>
+        </w:tabs>
+        <w:ind w:left="1800"/>
+        <w:rPr>
+          <w:rFonts w:ascii="Arial" w:hAnsi="Arial" w:cs="Arial"/>
+          <w:sz w:val="30"/>
+          <w:szCs w:val="30"/>
+        </w:rPr>
+      </w:pPr>
+      <w:r>
+        <w:rPr>
+          <w:rStyle w:val="Strong"/>
+          <w:rFonts w:ascii="Arial" w:eastAsiaTheme="majorEastAsia" w:hAnsi="Arial" w:cs="Arial"/>
+          <w:sz w:val="30"/>
+          <w:szCs w:val="30"/>
+        </w:rPr>
+        <w:t>Summary Statistics Section</w:t>
+      </w:r>
+    </w:p>
+    <w:p>
+      <w:pPr>
+        <w:pStyle w:val="NormalWeb"/>
+        <w:numPr>
+          <w:ilvl w:val="0"/>
+          <w:numId w:val="43"/>
+        </w:numPr>
+        <w:ind w:left="2520"/>
+        <w:rPr>
+          <w:rFonts w:ascii="Arial" w:hAnsi="Arial" w:cs="Arial"/>
+          <w:sz w:val="30"/>
+          <w:szCs w:val="30"/>
+        </w:rPr>
+      </w:pPr>
+      <w:r>
+        <w:rPr>
+          <w:rFonts w:ascii="Arial" w:hAnsi="Arial" w:cs="Arial"/>
+          <w:sz w:val="30"/>
+          <w:szCs w:val="30"/>
+        </w:rPr>
+        <w:t>Displays key metrics as cards:</w:t>
+      </w:r>
+    </w:p>
+    <w:p>
+      <w:pPr>
+        <w:pStyle w:val="NormalWeb"/>
+        <w:numPr>
+          <w:ilvl w:val="1"/>
+          <w:numId w:val="43"/>
+        </w:numPr>
+        <w:ind w:left="3240"/>
+        <w:rPr>
+          <w:rFonts w:ascii="Arial" w:hAnsi="Arial" w:cs="Arial"/>
+          <w:sz w:val="30"/>
+          <w:szCs w:val="30"/>
+        </w:rPr>
+      </w:pPr>
+      <w:r>
+        <w:rPr>
+          <w:rFonts w:ascii="Arial" w:hAnsi="Arial" w:cs="Arial"/>
+          <w:sz w:val="30"/>
+          <w:szCs w:val="30"/>
+        </w:rPr>
+        <w:t>Total Transactions</w:t>
+      </w:r>
+    </w:p>
+    <w:p>
+      <w:pPr>
+        <w:pStyle w:val="NormalWeb"/>
+        <w:numPr>
+          <w:ilvl w:val="1"/>
+          <w:numId w:val="43"/>
+        </w:numPr>
+        <w:ind w:left="3240"/>
+        <w:rPr>
+          <w:rFonts w:ascii="Arial" w:hAnsi="Arial" w:cs="Arial"/>
+          <w:sz w:val="30"/>
+          <w:szCs w:val="30"/>
+        </w:rPr>
+      </w:pPr>
+      <w:r>
+        <w:rPr>
+          <w:rFonts w:ascii="Arial" w:hAnsi="Arial" w:cs="Arial"/>
+          <w:sz w:val="30"/>
+          <w:szCs w:val="30"/>
+        </w:rPr>
+        <w:t>Total Anomalies</w:t>
+      </w:r>
+    </w:p>
+    <w:p>
+      <w:pPr>
+        <w:pStyle w:val="NormalWeb"/>
+        <w:numPr>
+          <w:ilvl w:val="1"/>
+          <w:numId w:val="43"/>
+        </w:numPr>
+        <w:ind w:left="3240"/>
+        <w:rPr>
+          <w:rFonts w:ascii="Arial" w:hAnsi="Arial" w:cs="Arial"/>
+          <w:sz w:val="30"/>
+          <w:szCs w:val="30"/>
+        </w:rPr>
+      </w:pPr>
+      <w:r>
+        <w:rPr>
+          <w:rFonts w:ascii="Arial" w:hAnsi="Arial" w:cs="Arial"/>
+          <w:sz w:val="30"/>
+          <w:szCs w:val="30"/>
+        </w:rPr>
+        <w:t>Mean Sales</w:t>
+      </w:r>
+    </w:p>
+    <w:p>
+      <w:pPr>
+        <w:pStyle w:val="NormalWeb"/>
+        <w:numPr>
+          <w:ilvl w:val="1"/>
+          <w:numId w:val="43"/>
+        </w:numPr>
+        <w:ind w:left="3240"/>
+        <w:rPr>
+          <w:rFonts w:ascii="Arial" w:hAnsi="Arial" w:cs="Arial"/>
+          <w:sz w:val="30"/>
+          <w:szCs w:val="30"/>
+        </w:rPr>
+      </w:pPr>
+      <w:r>
+        <w:rPr>
+          <w:rFonts w:ascii="Arial" w:hAnsi="Arial" w:cs="Arial"/>
+          <w:sz w:val="30"/>
+          <w:szCs w:val="30"/>
+        </w:rPr>
+        <w:t>Standard Deviation of Sales</w:t>
+      </w:r>
+    </w:p>
+    <w:p>
+      <w:pPr>
+        <w:pStyle w:val="NormalWeb"/>
+        <w:numPr>
+          <w:ilvl w:val="1"/>
+          <w:numId w:val="43"/>
+        </w:numPr>
+        <w:ind w:left="3240"/>
+        <w:rPr>
+          <w:rFonts w:ascii="Arial" w:hAnsi="Arial" w:cs="Arial"/>
+          <w:sz w:val="30"/>
+          <w:szCs w:val="30"/>
+        </w:rPr>
+      </w:pPr>
+      <w:r>
+        <w:rPr>
+          <w:rFonts w:ascii="Arial" w:hAnsi="Arial" w:cs="Arial"/>
+          <w:sz w:val="30"/>
+          <w:szCs w:val="30"/>
+        </w:rPr>
+        <w:t>Anomaly Percentage</w:t>
+      </w:r>
+    </w:p>
+    <w:p>
+      <w:pPr>
+        <w:pStyle w:val="NormalWeb"/>
+        <w:numPr>
+          <w:ilvl w:val="0"/>
+          <w:numId w:val="41"/>
+        </w:numPr>
+        <w:tabs>
+          <w:tab w:val="clear" w:pos="720"/>
+          <w:tab w:val="num" w:pos="1800"/>
+        </w:tabs>
+        <w:ind w:left="1800"/>
+        <w:rPr>
+          <w:rFonts w:ascii="Arial" w:hAnsi="Arial" w:cs="Arial"/>
+          <w:sz w:val="30"/>
+          <w:szCs w:val="30"/>
+        </w:rPr>
+      </w:pPr>
+      <w:r>
+        <w:rPr>
+          <w:rStyle w:val="Strong"/>
+          <w:rFonts w:ascii="Arial" w:eastAsiaTheme="majorEastAsia" w:hAnsi="Arial" w:cs="Arial"/>
+          <w:sz w:val="30"/>
+          <w:szCs w:val="30"/>
+        </w:rPr>
+        <w:t>Anomalies Detected Section</w:t>
+      </w:r>
+    </w:p>
+    <w:p>
+      <w:pPr>
+        <w:pStyle w:val="NormalWeb"/>
+        <w:numPr>
+          <w:ilvl w:val="0"/>
+          <w:numId w:val="43"/>
+        </w:numPr>
+        <w:ind w:left="2520"/>
+        <w:rPr>
+          <w:rFonts w:ascii="Arial" w:hAnsi="Arial" w:cs="Arial"/>
+          <w:sz w:val="30"/>
+          <w:szCs w:val="30"/>
+        </w:rPr>
+      </w:pPr>
+      <w:r>
+        <w:rPr>
+          <w:rFonts w:ascii="Arial" w:hAnsi="Arial" w:cs="Arial"/>
+          <w:sz w:val="30"/>
+          <w:szCs w:val="30"/>
+        </w:rPr>
+        <w:t xml:space="preserve">Label: </w:t>
+      </w:r>
+      <w:r>
+        <w:rPr>
+          <w:rStyle w:val="Emphasis"/>
+          <w:rFonts w:ascii="Arial" w:eastAsiaTheme="majorEastAsia" w:hAnsi="Arial" w:cs="Arial"/>
+          <w:sz w:val="30"/>
+          <w:szCs w:val="30"/>
+        </w:rPr>
+        <w:t>“Anomalies Detected (Scrollable)”</w:t>
+      </w:r>
+    </w:p>
+    <w:p>
+      <w:pPr>
+        <w:pStyle w:val="NormalWeb"/>
+        <w:numPr>
+          <w:ilvl w:val="0"/>
+          <w:numId w:val="43"/>
+        </w:numPr>
+        <w:ind w:left="2520"/>
+        <w:rPr>
+          <w:rFonts w:ascii="Arial" w:hAnsi="Arial" w:cs="Arial"/>
+          <w:sz w:val="30"/>
+          <w:szCs w:val="30"/>
+        </w:rPr>
+      </w:pPr>
+      <w:r>
+        <w:rPr>
+          <w:rFonts w:ascii="Arial" w:hAnsi="Arial" w:cs="Arial"/>
+          <w:sz w:val="30"/>
+          <w:szCs w:val="30"/>
+        </w:rPr>
+        <w:t>Shows only rows flagged as anomalies (</w:t>
+      </w:r>
+      <w:r>
+        <w:rPr>
+          <w:rStyle w:val="HTMLCode"/>
+          <w:rFonts w:ascii="Arial" w:eastAsiaTheme="majorEastAsia" w:hAnsi="Arial" w:cs="Arial"/>
+          <w:sz w:val="30"/>
+          <w:szCs w:val="30"/>
+        </w:rPr>
+        <w:t>is_anomaly = True</w:t>
+      </w:r>
+      <w:r>
+        <w:rPr>
+          <w:rFonts w:ascii="Arial" w:hAnsi="Arial" w:cs="Arial"/>
+          <w:sz w:val="30"/>
+          <w:szCs w:val="30"/>
+        </w:rPr>
+        <w:t>).</w:t>
+      </w:r>
+    </w:p>
+    <w:p>
+      <w:pPr>
+        <w:pStyle w:val="NormalWeb"/>
+        <w:numPr>
+          <w:ilvl w:val="0"/>
+          <w:numId w:val="43"/>
+        </w:numPr>
+        <w:ind w:left="2520"/>
+        <w:rPr>
+          <w:rFonts w:ascii="Arial" w:hAnsi="Arial" w:cs="Arial"/>
+          <w:sz w:val="30"/>
+          <w:szCs w:val="30"/>
+        </w:rPr>
+      </w:pPr>
+      <w:r>
+        <w:rPr>
+          <w:rFonts w:ascii="Arial" w:hAnsi="Arial" w:cs="Arial"/>
+          <w:sz w:val="30"/>
+          <w:szCs w:val="30"/>
+        </w:rPr>
+        <w:t>Fixed height (~300px) with vertical scroll bar for easy navigation.</w:t>
+      </w:r>
+    </w:p>
+    <w:p>
+      <w:pPr>
+        <w:pStyle w:val="NormalWeb"/>
+        <w:numPr>
+          <w:ilvl w:val="0"/>
+          <w:numId w:val="42"/>
+        </w:numPr>
+        <w:tabs>
+          <w:tab w:val="clear" w:pos="720"/>
+          <w:tab w:val="num" w:pos="1800"/>
+        </w:tabs>
+        <w:ind w:left="1800"/>
+        <w:rPr>
+          <w:rFonts w:ascii="Arial" w:hAnsi="Arial" w:cs="Arial"/>
+          <w:sz w:val="30"/>
+          <w:szCs w:val="30"/>
+        </w:rPr>
+      </w:pPr>
+      <w:r>
+        <w:rPr>
+          <w:rStyle w:val="Strong"/>
+          <w:rFonts w:ascii="Arial" w:eastAsiaTheme="majorEastAsia" w:hAnsi="Arial" w:cs="Arial"/>
+          <w:sz w:val="30"/>
+          <w:szCs w:val="30"/>
+        </w:rPr>
+        <w:t>Visualization Section</w:t>
+      </w:r>
+    </w:p>
+    <w:p>
+      <w:pPr>
+        <w:pStyle w:val="NormalWeb"/>
+        <w:numPr>
+          <w:ilvl w:val="0"/>
+          <w:numId w:val="43"/>
+        </w:numPr>
+        <w:ind w:left="2520"/>
+        <w:rPr>
+          <w:rFonts w:ascii="Arial" w:hAnsi="Arial" w:cs="Arial"/>
+          <w:sz w:val="30"/>
+          <w:szCs w:val="30"/>
+        </w:rPr>
+      </w:pPr>
+      <w:r>
+        <w:rPr>
+          <w:rFonts w:ascii="Arial" w:hAnsi="Arial" w:cs="Arial"/>
+          <w:sz w:val="30"/>
+          <w:szCs w:val="30"/>
+        </w:rPr>
+        <w:t xml:space="preserve">Title: </w:t>
+      </w:r>
+      <w:r>
+        <w:rPr>
+          <w:rStyle w:val="Emphasis"/>
+          <w:rFonts w:ascii="Arial" w:eastAsiaTheme="majorEastAsia" w:hAnsi="Arial" w:cs="Arial"/>
+          <w:sz w:val="30"/>
+          <w:szCs w:val="30"/>
+        </w:rPr>
+        <w:t>“Sales Anomaly Detection”</w:t>
+      </w:r>
+    </w:p>
+    <w:p>
+      <w:pPr>
+        <w:pStyle w:val="NormalWeb"/>
+        <w:numPr>
+          <w:ilvl w:val="0"/>
+          <w:numId w:val="43"/>
+        </w:numPr>
+        <w:ind w:left="2520"/>
+        <w:rPr>
+          <w:rFonts w:ascii="Arial" w:hAnsi="Arial" w:cs="Arial"/>
+          <w:sz w:val="30"/>
+          <w:szCs w:val="30"/>
+        </w:rPr>
+      </w:pPr>
+      <w:r>
+        <w:rPr>
+          <w:rFonts w:ascii="Arial" w:hAnsi="Arial" w:cs="Arial"/>
+          <w:sz w:val="30"/>
+          <w:szCs w:val="30"/>
+        </w:rPr>
+        <w:t>Scatter plot visualization:</w:t>
+      </w:r>
+    </w:p>
+    <w:p>
+      <w:pPr>
+        <w:pStyle w:val="NormalWeb"/>
+        <w:numPr>
+          <w:ilvl w:val="1"/>
+          <w:numId w:val="43"/>
+        </w:numPr>
+        <w:ind w:left="3240"/>
+        <w:rPr>
+          <w:rFonts w:ascii="Arial" w:hAnsi="Arial" w:cs="Arial"/>
+          <w:sz w:val="30"/>
+          <w:szCs w:val="30"/>
+        </w:rPr>
+      </w:pPr>
+      <w:r>
+        <w:rPr>
+          <w:rFonts w:ascii="Arial" w:hAnsi="Arial" w:cs="Arial"/>
+          <w:sz w:val="30"/>
+          <w:szCs w:val="30"/>
+        </w:rPr>
+        <w:t>Blue dots → Normal transactions</w:t>
+      </w:r>
+    </w:p>
+    <w:p>
+      <w:pPr>
+        <w:pStyle w:val="NormalWeb"/>
+        <w:numPr>
+          <w:ilvl w:val="1"/>
+          <w:numId w:val="43"/>
+        </w:numPr>
+        <w:ind w:left="3240"/>
+        <w:rPr>
+          <w:rFonts w:ascii="Arial" w:hAnsi="Arial" w:cs="Arial"/>
+          <w:sz w:val="30"/>
+          <w:szCs w:val="30"/>
+        </w:rPr>
+      </w:pPr>
+      <w:r>
+        <w:rPr>
+          <w:rFonts w:ascii="Arial" w:hAnsi="Arial" w:cs="Arial"/>
+          <w:sz w:val="30"/>
+          <w:szCs w:val="30"/>
+        </w:rPr>
+        <w:lastRenderedPageBreak/>
+        <w:t>Red “X” markers → Anomalies</w:t>
+      </w:r>
+    </w:p>
+    <w:p>
+      <w:pPr>
+        <w:pStyle w:val="NormalWeb"/>
+        <w:numPr>
+          <w:ilvl w:val="0"/>
+          <w:numId w:val="43"/>
+        </w:numPr>
+        <w:ind w:left="2520"/>
+        <w:rPr>
+          <w:rFonts w:ascii="Arial" w:hAnsi="Arial" w:cs="Arial"/>
+          <w:sz w:val="30"/>
+          <w:szCs w:val="30"/>
+        </w:rPr>
+      </w:pPr>
+      <w:r>
+        <w:rPr>
+          <w:rFonts w:ascii="Arial" w:hAnsi="Arial" w:cs="Arial"/>
+          <w:sz w:val="30"/>
+          <w:szCs w:val="30"/>
+        </w:rPr>
+        <w:t>Reference lines:</w:t>
+      </w:r>
+    </w:p>
+    <w:p>
+      <w:pPr>
+        <w:pStyle w:val="NormalWeb"/>
+        <w:numPr>
+          <w:ilvl w:val="1"/>
+          <w:numId w:val="43"/>
+        </w:numPr>
+        <w:ind w:left="3240"/>
+        <w:rPr>
+          <w:rFonts w:ascii="Arial" w:hAnsi="Arial" w:cs="Arial"/>
+          <w:sz w:val="30"/>
+          <w:szCs w:val="30"/>
+        </w:rPr>
+      </w:pPr>
+      <w:r>
+        <w:rPr>
+          <w:rFonts w:ascii="Arial" w:hAnsi="Arial" w:cs="Arial"/>
+          <w:sz w:val="30"/>
+          <w:szCs w:val="30"/>
+        </w:rPr>
+        <w:t>Green dashed line → Mean Sales</w:t>
+      </w:r>
+    </w:p>
+    <w:p>
+      <w:pPr>
+        <w:pStyle w:val="NormalWeb"/>
+        <w:numPr>
+          <w:ilvl w:val="1"/>
+          <w:numId w:val="43"/>
+        </w:numPr>
+        <w:ind w:left="3240"/>
+        <w:rPr>
+          <w:rFonts w:ascii="Arial" w:hAnsi="Arial" w:cs="Arial"/>
+          <w:sz w:val="30"/>
+          <w:szCs w:val="30"/>
+        </w:rPr>
+      </w:pPr>
+      <w:r>
+        <w:rPr>
+          <w:rFonts w:ascii="Arial" w:hAnsi="Arial" w:cs="Arial"/>
+          <w:sz w:val="30"/>
+          <w:szCs w:val="30"/>
+        </w:rPr>
+        <w:t>Orange dashed lines → ±3σ thresholds</w:t>
+      </w:r>
+    </w:p>
+    <w:p>
+      <w:pPr>
+        <w:pStyle w:val="NormalWeb"/>
+        <w:numPr>
+          <w:ilvl w:val="0"/>
+          <w:numId w:val="43"/>
+        </w:numPr>
+        <w:ind w:left="2520"/>
+        <w:rPr>
+          <w:rFonts w:ascii="Arial" w:hAnsi="Arial" w:cs="Arial"/>
+          <w:sz w:val="30"/>
+          <w:szCs w:val="30"/>
+        </w:rPr>
+      </w:pPr>
+      <w:r>
+        <w:rPr>
+          <w:rFonts w:ascii="Arial" w:hAnsi="Arial" w:cs="Arial"/>
+          <w:sz w:val="30"/>
+          <w:szCs w:val="30"/>
+        </w:rPr>
+        <w:t>Axes:</w:t>
+      </w:r>
+    </w:p>
+    <w:p>
+      <w:pPr>
+        <w:pStyle w:val="NormalWeb"/>
+        <w:numPr>
+          <w:ilvl w:val="1"/>
+          <w:numId w:val="43"/>
+        </w:numPr>
+        <w:ind w:left="3240"/>
+        <w:rPr>
+          <w:rFonts w:ascii="Arial" w:hAnsi="Arial" w:cs="Arial"/>
+          <w:sz w:val="30"/>
+          <w:szCs w:val="30"/>
+        </w:rPr>
+      </w:pPr>
+      <w:r>
+        <w:rPr>
+          <w:rFonts w:ascii="Arial" w:hAnsi="Arial" w:cs="Arial"/>
+          <w:sz w:val="30"/>
+          <w:szCs w:val="30"/>
+        </w:rPr>
+        <w:t>X-axis → Transaction Index</w:t>
+      </w:r>
+    </w:p>
+    <w:p>
+      <w:pPr>
+        <w:pStyle w:val="NormalWeb"/>
+        <w:numPr>
+          <w:ilvl w:val="1"/>
+          <w:numId w:val="43"/>
+        </w:numPr>
+        <w:ind w:left="3240"/>
+        <w:rPr>
+          <w:rFonts w:ascii="Arial" w:hAnsi="Arial" w:cs="Arial"/>
+          <w:sz w:val="30"/>
+          <w:szCs w:val="30"/>
+        </w:rPr>
+      </w:pPr>
+      <w:r>
+        <w:rPr>
+          <w:rFonts w:ascii="Arial" w:hAnsi="Arial" w:cs="Arial"/>
+          <w:sz w:val="30"/>
+          <w:szCs w:val="30"/>
+        </w:rPr>
+        <w:t>Y-axis → Sales</w:t>
+      </w:r>
+    </w:p>
+    <w:p>
+      <w:pPr>
+        <w:pStyle w:val="NormalWeb"/>
+        <w:numPr>
+          <w:ilvl w:val="0"/>
+          <w:numId w:val="43"/>
+        </w:numPr>
+        <w:ind w:left="2520"/>
+      </w:pPr>
+      <w:r>
+        <w:rPr>
+          <w:rFonts w:ascii="Arial" w:hAnsi="Arial" w:cs="Arial"/>
+          <w:sz w:val="30"/>
+          <w:szCs w:val="30"/>
+        </w:rPr>
+        <w:t>Legend included for clarity</w:t>
+      </w:r>
+      <w:r>
+        <w:t>.</w:t>
+      </w:r>
+    </w:p>
+    <w:p>
+      <w:pPr>
+        <w:pStyle w:val="NormalWeb"/>
+      </w:pPr>
+    </w:p>
+    <w:p>
+      <w:pPr>
+        <w:pStyle w:val="NormalWeb"/>
+      </w:pPr>
+    </w:p>
+    <w:p>
+      <w:pPr>
+        <w:pStyle w:val="NormalWeb"/>
+      </w:pPr>
+      <w:r>
+        <w:rPr>
+          <w:noProof/>
+        </w:rPr>
+        <w:drawing>
+          <wp:inline distT="0" distB="0" distL="0" distR="0" wp14:anchorId="2CEB15C6" wp14:editId="38039A13">
+            <wp:extent cx="5731510" cy="6096000"/>
+            <wp:effectExtent l="0" t="0" r="2540" b="0"/>
+            <wp:docPr id="1" name="Picture 1"/>
+            <wp:cNvGraphicFramePr>
+              <a:graphicFrameLocks xmlns:a="http://schemas.openxmlformats.org/drawingml/2006/main" noChangeAspect="1"/>
+            </wp:cNvGraphicFramePr>
+            <a:graphic xmlns:a="http://schemas.openxmlformats.org/drawingml/2006/main">
+              <a:graphicData uri="http://schemas.openxmlformats.org/drawingml/2006/picture">
+                <pic:pic xmlns:pic="http://schemas.openxmlformats.org/drawingml/2006/picture">
+                  <pic:nvPicPr>
+                    <pic:cNvPr id="1" name=""/>
+                    <pic:cNvPicPr/>
+                  </pic:nvPicPr>
+                  <pic:blipFill>
+                    <a:blip r:embed="rId7"/>
+                    <a:stretch>
+                      <a:fillRect/>
+                    </a:stretch>
+                  </pic:blipFill>
+                  <pic:spPr>
+                    <a:xfrm>
+                      <a:off x="0" y="0"/>
+                      <a:ext cx="5731510" cy="6096000"/>
+                    </a:xfrm>
+                    <a:prstGeom prst="rect">
+                      <a:avLst/>
+                    </a:prstGeom>
+                  </pic:spPr>
+                </pic:pic>
+              </a:graphicData>
+            </a:graphic>
+          </wp:inline>
+        </w:drawing>
       </w:r>
     </w:p>
     <w:p>
@@ -4969,7 +5719,7 @@
                     <pic:cNvPicPr/>
                   </pic:nvPicPr>
                   <pic:blipFill>
-                    <a:blip r:embed="rId7">
+                    <a:blip r:embed="rId8">
                       <a:extLst>
                         <a:ext uri="{28A0092B-C50C-407E-A947-70E740481C1C}">
                           <a14:useLocalDpi xmlns:a14="http://schemas.microsoft.com/office/drawing/2010/main" val="0"/>
@@ -5310,7 +6060,7 @@
                     <pic:cNvPicPr/>
                   </pic:nvPicPr>
                   <pic:blipFill>
-                    <a:blip r:embed="rId8">
+                    <a:blip r:embed="rId9">
                       <a:extLst>
                         <a:ext uri="{28A0092B-C50C-407E-A947-70E740481C1C}">
                           <a14:useLocalDpi xmlns:a14="http://schemas.microsoft.com/office/drawing/2010/main" val="0"/>
@@ -5451,23 +6201,13 @@
           <w:szCs w:val="30"/>
         </w:rPr>
       </w:pPr>
-      <w:proofErr w:type="spellStart"/>
-      <w:r>
-        <w:rPr>
-          <w:rFonts w:ascii="Arial" w:hAnsi="Arial" w:cs="Arial"/>
-          <w:sz w:val="30"/>
-          <w:szCs w:val="30"/>
-        </w:rPr>
-        <w:t>z_score</w:t>
-      </w:r>
-      <w:proofErr w:type="spellEnd"/>
-      <w:r>
-        <w:rPr>
-          <w:rFonts w:ascii="Arial" w:hAnsi="Arial" w:cs="Arial"/>
-          <w:sz w:val="30"/>
-          <w:szCs w:val="30"/>
-        </w:rPr>
-        <w:t xml:space="preserve"> → Standardized score for each transaction.</w:t>
+      <w:r>
+        <w:rPr>
+          <w:rFonts w:ascii="Arial" w:hAnsi="Arial" w:cs="Arial"/>
+          <w:sz w:val="30"/>
+          <w:szCs w:val="30"/>
+        </w:rPr>
+        <w:t>z_score → Standardized score for each transaction.</w:t>
       </w:r>
     </w:p>
     <w:p>
@@ -5501,23 +6241,13 @@
           <w:szCs w:val="30"/>
         </w:rPr>
       </w:pPr>
-      <w:proofErr w:type="spellStart"/>
-      <w:r>
-        <w:rPr>
-          <w:rFonts w:ascii="Arial" w:hAnsi="Arial" w:cs="Arial"/>
-          <w:sz w:val="30"/>
-          <w:szCs w:val="30"/>
-        </w:rPr>
-        <w:t>is_anomaly</w:t>
-      </w:r>
-      <w:proofErr w:type="spellEnd"/>
-      <w:r>
-        <w:rPr>
-          <w:rFonts w:ascii="Arial" w:hAnsi="Arial" w:cs="Arial"/>
-          <w:sz w:val="30"/>
-          <w:szCs w:val="30"/>
-        </w:rPr>
-        <w:t xml:space="preserve"> → Boolean flag indicating anomaly status.</w:t>
+      <w:r>
+        <w:rPr>
+          <w:rFonts w:ascii="Arial" w:hAnsi="Arial" w:cs="Arial"/>
+          <w:sz w:val="30"/>
+          <w:szCs w:val="30"/>
+        </w:rPr>
+        <w:t>is_anomaly → Boolean flag indicating anomaly status.</w:t>
       </w:r>
     </w:p>
     <w:p>
@@ -5597,7 +6327,7 @@
                     <pic:cNvPicPr/>
                   </pic:nvPicPr>
                   <pic:blipFill>
-                    <a:blip r:embed="rId9">
+                    <a:blip r:embed="rId10">
                       <a:extLst>
                         <a:ext uri="{28A0092B-C50C-407E-A947-70E740481C1C}">
                           <a14:useLocalDpi xmlns:a14="http://schemas.microsoft.com/office/drawing/2010/main" val="0"/>
@@ -6658,7 +7388,7 @@
         </w:rPr>
         <w:t xml:space="preserve"> Official Python 3.x documentation for programming language features and libraries. </w:t>
       </w:r>
-      <w:hyperlink r:id="rId10" w:tgtFrame="_blank" w:tooltip="docs.python.org" w:history="1">
+      <w:hyperlink r:id="rId11" w:tgtFrame="_blank" w:tooltip="docs.python.org" w:history="1">
         <w:r>
           <w:rPr>
             <w:rStyle w:val="Hyperlink"/>
@@ -6701,7 +7431,7 @@
         </w:rPr>
         <w:t xml:space="preserve"> Used for data ingestion, preprocessing, and statistical calculations. </w:t>
       </w:r>
-      <w:hyperlink r:id="rId11" w:tgtFrame="_blank" w:tooltip="pandas.pydata.org" w:history="1">
+      <w:hyperlink r:id="rId12" w:tgtFrame="_blank" w:tooltip="pandas.pydata.org" w:history="1">
         <w:r>
           <w:rPr>
             <w:rStyle w:val="Hyperlink"/>
@@ -6744,7 +7474,7 @@
         </w:rPr>
         <w:t xml:space="preserve"> Used for anomaly visualization (scatter plots). </w:t>
       </w:r>
-      <w:hyperlink r:id="rId12" w:tgtFrame="_blank" w:tooltip="matplotlib.org" w:history="1">
+      <w:hyperlink r:id="rId13" w:tgtFrame="_blank" w:tooltip="matplotlib.org" w:history="1">
         <w:r>
           <w:rPr>
             <w:rStyle w:val="Hyperlink"/>
@@ -7049,7 +7779,7 @@
                     <pic:cNvPicPr/>
                   </pic:nvPicPr>
                   <pic:blipFill>
-                    <a:blip r:embed="rId13">
+                    <a:blip r:embed="rId14">
                       <a:extLst>
                         <a:ext uri="{28A0092B-C50C-407E-A947-70E740481C1C}">
                           <a14:useLocalDpi xmlns:a14="http://schemas.microsoft.com/office/drawing/2010/main" val="0"/>
@@ -7142,6 +7872,7 @@
       <w:r>
         <w:rPr>
           <w:rFonts w:ascii="Arial" w:hAnsi="Arial" w:cs="Arial"/>
+          <w:noProof/>
           <w:sz w:val="30"/>
           <w:szCs w:val="30"/>
         </w:rPr>
@@ -7161,7 +7892,7 @@
                     <pic:cNvPicPr/>
                   </pic:nvPicPr>
                   <pic:blipFill>
-                    <a:blip r:embed="rId14"/>
+                    <a:blip r:embed="rId15"/>
                     <a:stretch>
                       <a:fillRect/>
                     </a:stretch>
@@ -7303,6 +8034,7 @@
       <w:r>
         <w:rPr>
           <w:rFonts w:ascii="Arial" w:hAnsi="Arial" w:cs="Arial"/>
+          <w:noProof/>
           <w:sz w:val="30"/>
           <w:szCs w:val="30"/>
         </w:rPr>
@@ -7322,7 +8054,7 @@
                     <pic:cNvPicPr/>
                   </pic:nvPicPr>
                   <pic:blipFill>
-                    <a:blip r:embed="rId15"/>
+                    <a:blip r:embed="rId16"/>
                     <a:stretch>
                       <a:fillRect/>
                     </a:stretch>
@@ -7383,8 +8115,8 @@
       </w:pPr>
     </w:p>
     <w:sectPr>
-      <w:headerReference w:type="default" r:id="rId16"/>
-      <w:footerReference w:type="default" r:id="rId17"/>
+      <w:headerReference w:type="default" r:id="rId17"/>
+      <w:footerReference w:type="default" r:id="rId18"/>
       <w:pgSz w:w="11906" w:h="16838"/>
       <w:pgMar w:top="1440" w:right="1440" w:bottom="1440" w:left="1440" w:header="708" w:footer="708" w:gutter="0"/>
       <w:cols w:space="708"/>
@@ -7395,7 +8127,7 @@
 </file>
 
 <file path=word/endnotes.xml><?xml version="1.0" encoding="utf-8"?>
-<w:endnotes xmlns:wpc="http://schemas.microsoft.com/office/word/2010/wordprocessingCanvas" xmlns:cx="http://schemas.microsoft.com/office/drawing/2014/chartex" xmlns:cx1="http://schemas.microsoft.com/office/drawing/2015/9/8/chartex" xmlns:cx2="http://schemas.microsoft.com/office/drawing/2015/10/21/chartex" xmlns:cx3="http://schemas.microsoft.com/office/drawing/2016/5/9/chartex" xmlns:cx4="http://schemas.microsoft.com/office/drawing/2016/5/10/chartex" xmlns:cx5="http://schemas.microsoft.com/office/drawing/2016/5/11/chartex" xmlns:cx6="http://schemas.microsoft.com/office/drawing/2016/5/12/chartex" xmlns:cx7="http://schemas.microsoft.com/office/drawing/2016/5/13/chartex" xmlns:cx8="http://schemas.microsoft.com/office/drawing/2016/5/14/chartex" xmlns:mc="http://schemas.openxmlformats.org/markup-compatibility/2006" xmlns:aink="http://schemas.microsoft.com/office/drawing/2016/ink" xmlns:am3d="http://schemas.microsoft.com/office/drawing/2017/model3d" xmlns:o="urn:schemas-microsoft-com:office:office" xmlns:oel="http://schemas.microsoft.com/office/2019/extlst" xmlns:r="http://schemas.openxmlformats.org/officeDocument/2006/relationships" xmlns:m="http://schemas.openxmlformats.org/officeDocument/2006/math" xmlns:v="urn:schemas-microsoft-com:vml" xmlns:wp14="http://schemas.microsoft.com/office/word/2010/wordprocessingDrawing" xmlns:wp="http://schemas.openxmlformats.org/drawingml/2006/wordprocessingDrawing" xmlns:w10="urn:schemas-microsoft-com:office:word" xmlns:w="http://schemas.openxmlformats.org/wordprocessingml/2006/main" xmlns:w14="http://schemas.microsoft.com/office/word/2010/wordml" xmlns:w15="http://schemas.microsoft.com/office/word/2012/wordml" xmlns:w16cex="http://schemas.microsoft.com/office/word/2018/wordml/cex" xmlns:w16cid="http://schemas.microsoft.com/office/word/2016/wordml/cid" xmlns:w16="http://schemas.microsoft.com/office/word/2018/wordml" xmlns:w16du="http://schemas.microsoft.com/office/word/2023/wordml/word16du" xmlns:w16sdtdh="http://schemas.microsoft.com/office/word/2020/wordml/sdtdatahash" xmlns:w16sdtfl="http://schemas.microsoft.com/office/word/2024/wordml/sdtformatlock" xmlns:w16se="http://schemas.microsoft.com/office/word/2015/wordml/symex" xmlns:wpg="http://schemas.microsoft.com/office/word/2010/wordprocessingGroup" xmlns:wpi="http://schemas.microsoft.com/office/word/2010/wordprocessingInk" xmlns:wne="http://schemas.microsoft.com/office/word/2006/wordml" xmlns:wps="http://schemas.microsoft.com/office/word/2010/wordprocessingShape" mc:Ignorable="w14 w15 w16se w16cid w16 w16cex w16sdtdh w16sdtfl w16du wp14">
+<w:endnotes xmlns:wpc="http://schemas.microsoft.com/office/word/2010/wordprocessingCanvas" xmlns:cx="http://schemas.microsoft.com/office/drawing/2014/chartex" xmlns:cx1="http://schemas.microsoft.com/office/drawing/2015/9/8/chartex" xmlns:cx2="http://schemas.microsoft.com/office/drawing/2015/10/21/chartex" xmlns:cx3="http://schemas.microsoft.com/office/drawing/2016/5/9/chartex" xmlns:cx4="http://schemas.microsoft.com/office/drawing/2016/5/10/chartex" xmlns:cx5="http://schemas.microsoft.com/office/drawing/2016/5/11/chartex" xmlns:cx6="http://schemas.microsoft.com/office/drawing/2016/5/12/chartex" xmlns:cx7="http://schemas.microsoft.com/office/drawing/2016/5/13/chartex" xmlns:cx8="http://schemas.microsoft.com/office/drawing/2016/5/14/chartex" xmlns:mc="http://schemas.openxmlformats.org/markup-compatibility/2006" xmlns:aink="http://schemas.microsoft.com/office/drawing/2016/ink" xmlns:am3d="http://schemas.microsoft.com/office/drawing/2017/model3d" xmlns:o="urn:schemas-microsoft-com:office:office" xmlns:r="http://schemas.openxmlformats.org/officeDocument/2006/relationships" xmlns:m="http://schemas.openxmlformats.org/officeDocument/2006/math" xmlns:v="urn:schemas-microsoft-com:vml" xmlns:wp14="http://schemas.microsoft.com/office/word/2010/wordprocessingDrawing" xmlns:wp="http://schemas.openxmlformats.org/drawingml/2006/wordprocessingDrawing" xmlns:w10="urn:schemas-microsoft-com:office:word" xmlns:w="http://schemas.openxmlformats.org/wordprocessingml/2006/main" xmlns:w14="http://schemas.microsoft.com/office/word/2010/wordml" xmlns:w15="http://schemas.microsoft.com/office/word/2012/wordml" xmlns:w16cex="http://schemas.microsoft.com/office/word/2018/wordml/cex" xmlns:w16cid="http://schemas.microsoft.com/office/word/2016/wordml/cid" xmlns:w16="http://schemas.microsoft.com/office/word/2018/wordml" xmlns:w16sdtdh="http://schemas.microsoft.com/office/word/2020/wordml/sdtdatahash" xmlns:w16se="http://schemas.microsoft.com/office/word/2015/wordml/symex" xmlns:wpg="http://schemas.microsoft.com/office/word/2010/wordprocessingGroup" xmlns:wpi="http://schemas.microsoft.com/office/word/2010/wordprocessingInk" xmlns:wne="http://schemas.microsoft.com/office/word/2006/wordml" xmlns:wps="http://schemas.microsoft.com/office/word/2010/wordprocessingShape" mc:Ignorable="w14 w15 w16se w16cid w16 w16cex w16sdtdh wp14">
   <w:endnote w:type="separator" w:id="-1">
     <w:p>
       <w:pPr>
@@ -7420,7 +8152,7 @@
 </file>
 
 <file path=word/footer1.xml><?xml version="1.0" encoding="utf-8"?>
-<w:ftr xmlns:wpc="http://schemas.microsoft.com/office/word/2010/wordprocessingCanvas" xmlns:cx="http://schemas.microsoft.com/office/drawing/2014/chartex" xmlns:cx1="http://schemas.microsoft.com/office/drawing/2015/9/8/chartex" xmlns:cx2="http://schemas.microsoft.com/office/drawing/2015/10/21/chartex" xmlns:cx3="http://schemas.microsoft.com/office/drawing/2016/5/9/chartex" xmlns:cx4="http://schemas.microsoft.com/office/drawing/2016/5/10/chartex" xmlns:cx5="http://schemas.microsoft.com/office/drawing/2016/5/11/chartex" xmlns:cx6="http://schemas.microsoft.com/office/drawing/2016/5/12/chartex" xmlns:cx7="http://schemas.microsoft.com/office/drawing/2016/5/13/chartex" xmlns:cx8="http://schemas.microsoft.com/office/drawing/2016/5/14/chartex" xmlns:mc="http://schemas.openxmlformats.org/markup-compatibility/2006" xmlns:aink="http://schemas.microsoft.com/office/drawing/2016/ink" xmlns:am3d="http://schemas.microsoft.com/office/drawing/2017/model3d" xmlns:o="urn:schemas-microsoft-com:office:office" xmlns:oel="http://schemas.microsoft.com/office/2019/extlst" xmlns:r="http://schemas.openxmlformats.org/officeDocument/2006/relationships" xmlns:m="http://schemas.openxmlformats.org/officeDocument/2006/math" xmlns:v="urn:schemas-microsoft-com:vml" xmlns:wp14="http://schemas.microsoft.com/office/word/2010/wordprocessingDrawing" xmlns:wp="http://schemas.openxmlformats.org/drawingml/2006/wordprocessingDrawing" xmlns:w10="urn:schemas-microsoft-com:office:word" xmlns:w="http://schemas.openxmlformats.org/wordprocessingml/2006/main" xmlns:w14="http://schemas.microsoft.com/office/word/2010/wordml" xmlns:w15="http://schemas.microsoft.com/office/word/2012/wordml" xmlns:w16cex="http://schemas.microsoft.com/office/word/2018/wordml/cex" xmlns:w16cid="http://schemas.microsoft.com/office/word/2016/wordml/cid" xmlns:w16="http://schemas.microsoft.com/office/word/2018/wordml" xmlns:w16du="http://schemas.microsoft.com/office/word/2023/wordml/word16du" xmlns:w16sdtdh="http://schemas.microsoft.com/office/word/2020/wordml/sdtdatahash" xmlns:w16sdtfl="http://schemas.microsoft.com/office/word/2024/wordml/sdtformatlock" xmlns:w16se="http://schemas.microsoft.com/office/word/2015/wordml/symex" xmlns:wpg="http://schemas.microsoft.com/office/word/2010/wordprocessingGroup" xmlns:wpi="http://schemas.microsoft.com/office/word/2010/wordprocessingInk" xmlns:wne="http://schemas.microsoft.com/office/word/2006/wordml" xmlns:wps="http://schemas.microsoft.com/office/word/2010/wordprocessingShape" mc:Ignorable="w14 w15 w16se w16cid w16 w16cex w16sdtdh w16sdtfl w16du wp14">
+<w:ftr xmlns:wpc="http://schemas.microsoft.com/office/word/2010/wordprocessingCanvas" xmlns:cx="http://schemas.microsoft.com/office/drawing/2014/chartex" xmlns:cx1="http://schemas.microsoft.com/office/drawing/2015/9/8/chartex" xmlns:cx2="http://schemas.microsoft.com/office/drawing/2015/10/21/chartex" xmlns:cx3="http://schemas.microsoft.com/office/drawing/2016/5/9/chartex" xmlns:cx4="http://schemas.microsoft.com/office/drawing/2016/5/10/chartex" xmlns:cx5="http://schemas.microsoft.com/office/drawing/2016/5/11/chartex" xmlns:cx6="http://schemas.microsoft.com/office/drawing/2016/5/12/chartex" xmlns:cx7="http://schemas.microsoft.com/office/drawing/2016/5/13/chartex" xmlns:cx8="http://schemas.microsoft.com/office/drawing/2016/5/14/chartex" xmlns:mc="http://schemas.openxmlformats.org/markup-compatibility/2006" xmlns:aink="http://schemas.microsoft.com/office/drawing/2016/ink" xmlns:am3d="http://schemas.microsoft.com/office/drawing/2017/model3d" xmlns:o="urn:schemas-microsoft-com:office:office" xmlns:r="http://schemas.openxmlformats.org/officeDocument/2006/relationships" xmlns:m="http://schemas.openxmlformats.org/officeDocument/2006/math" xmlns:v="urn:schemas-microsoft-com:vml" xmlns:wp14="http://schemas.microsoft.com/office/word/2010/wordprocessingDrawing" xmlns:wp="http://schemas.openxmlformats.org/drawingml/2006/wordprocessingDrawing" xmlns:w10="urn:schemas-microsoft-com:office:word" xmlns:w="http://schemas.openxmlformats.org/wordprocessingml/2006/main" xmlns:w14="http://schemas.microsoft.com/office/word/2010/wordml" xmlns:w15="http://schemas.microsoft.com/office/word/2012/wordml" xmlns:w16cex="http://schemas.microsoft.com/office/word/2018/wordml/cex" xmlns:w16cid="http://schemas.microsoft.com/office/word/2016/wordml/cid" xmlns:w16="http://schemas.microsoft.com/office/word/2018/wordml" xmlns:w16sdtdh="http://schemas.microsoft.com/office/word/2020/wordml/sdtdatahash" xmlns:w16se="http://schemas.microsoft.com/office/word/2015/wordml/symex" xmlns:wpg="http://schemas.microsoft.com/office/word/2010/wordprocessingGroup" xmlns:wpi="http://schemas.microsoft.com/office/word/2010/wordprocessingInk" xmlns:wne="http://schemas.microsoft.com/office/word/2006/wordml" xmlns:wps="http://schemas.microsoft.com/office/word/2010/wordprocessingShape" mc:Ignorable="w14 w15 w16se w16cid w16 w16cex w16sdtdh wp14">
   <w:sdt>
     <w:sdtPr>
       <w:id w:val="-1870675665"/>
@@ -7476,7 +8208,7 @@
 </file>
 
 <file path=word/footnotes.xml><?xml version="1.0" encoding="utf-8"?>
-<w:footnotes xmlns:wpc="http://schemas.microsoft.com/office/word/2010/wordprocessingCanvas" xmlns:cx="http://schemas.microsoft.com/office/drawing/2014/chartex" xmlns:cx1="http://schemas.microsoft.com/office/drawing/2015/9/8/chartex" xmlns:cx2="http://schemas.microsoft.com/office/drawing/2015/10/21/chartex" xmlns:cx3="http://schemas.microsoft.com/office/drawing/2016/5/9/chartex" xmlns:cx4="http://schemas.microsoft.com/office/drawing/2016/5/10/chartex" xmlns:cx5="http://schemas.microsoft.com/office/drawing/2016/5/11/chartex" xmlns:cx6="http://schemas.microsoft.com/office/drawing/2016/5/12/chartex" xmlns:cx7="http://schemas.microsoft.com/office/drawing/2016/5/13/chartex" xmlns:cx8="http://schemas.microsoft.com/office/drawing/2016/5/14/chartex" xmlns:mc="http://schemas.openxmlformats.org/markup-compatibility/2006" xmlns:aink="http://schemas.microsoft.com/office/drawing/2016/ink" xmlns:am3d="http://schemas.microsoft.com/office/drawing/2017/model3d" xmlns:o="urn:schemas-microsoft-com:office:office" xmlns:oel="http://schemas.microsoft.com/office/2019/extlst" xmlns:r="http://schemas.openxmlformats.org/officeDocument/2006/relationships" xmlns:m="http://schemas.openxmlformats.org/officeDocument/2006/math" xmlns:v="urn:schemas-microsoft-com:vml" xmlns:wp14="http://schemas.microsoft.com/office/word/2010/wordprocessingDrawing" xmlns:wp="http://schemas.openxmlformats.org/drawingml/2006/wordprocessingDrawing" xmlns:w10="urn:schemas-microsoft-com:office:word" xmlns:w="http://schemas.openxmlformats.org/wordprocessingml/2006/main" xmlns:w14="http://schemas.microsoft.com/office/word/2010/wordml" xmlns:w15="http://schemas.microsoft.com/office/word/2012/wordml" xmlns:w16cex="http://schemas.microsoft.com/office/word/2018/wordml/cex" xmlns:w16cid="http://schemas.microsoft.com/office/word/2016/wordml/cid" xmlns:w16="http://schemas.microsoft.com/office/word/2018/wordml" xmlns:w16du="http://schemas.microsoft.com/office/word/2023/wordml/word16du" xmlns:w16sdtdh="http://schemas.microsoft.com/office/word/2020/wordml/sdtdatahash" xmlns:w16sdtfl="http://schemas.microsoft.com/office/word/2024/wordml/sdtformatlock" xmlns:w16se="http://schemas.microsoft.com/office/word/2015/wordml/symex" xmlns:wpg="http://schemas.microsoft.com/office/word/2010/wordprocessingGroup" xmlns:wpi="http://schemas.microsoft.com/office/word/2010/wordprocessingInk" xmlns:wne="http://schemas.microsoft.com/office/word/2006/wordml" xmlns:wps="http://schemas.microsoft.com/office/word/2010/wordprocessingShape" mc:Ignorable="w14 w15 w16se w16cid w16 w16cex w16sdtdh w16sdtfl w16du wp14">
+<w:footnotes xmlns:wpc="http://schemas.microsoft.com/office/word/2010/wordprocessingCanvas" xmlns:cx="http://schemas.microsoft.com/office/drawing/2014/chartex" xmlns:cx1="http://schemas.microsoft.com/office/drawing/2015/9/8/chartex" xmlns:cx2="http://schemas.microsoft.com/office/drawing/2015/10/21/chartex" xmlns:cx3="http://schemas.microsoft.com/office/drawing/2016/5/9/chartex" xmlns:cx4="http://schemas.microsoft.com/office/drawing/2016/5/10/chartex" xmlns:cx5="http://schemas.microsoft.com/office/drawing/2016/5/11/chartex" xmlns:cx6="http://schemas.microsoft.com/office/drawing/2016/5/12/chartex" xmlns:cx7="http://schemas.microsoft.com/office/drawing/2016/5/13/chartex" xmlns:cx8="http://schemas.microsoft.com/office/drawing/2016/5/14/chartex" xmlns:mc="http://schemas.openxmlformats.org/markup-compatibility/2006" xmlns:aink="http://schemas.microsoft.com/office/drawing/2016/ink" xmlns:am3d="http://schemas.microsoft.com/office/drawing/2017/model3d" xmlns:o="urn:schemas-microsoft-com:office:office" xmlns:r="http://schemas.openxmlformats.org/officeDocument/2006/relationships" xmlns:m="http://schemas.openxmlformats.org/officeDocument/2006/math" xmlns:v="urn:schemas-microsoft-com:vml" xmlns:wp14="http://schemas.microsoft.com/office/word/2010/wordprocessingDrawing" xmlns:wp="http://schemas.openxmlformats.org/drawingml/2006/wordprocessingDrawing" xmlns:w10="urn:schemas-microsoft-com:office:word" xmlns:w="http://schemas.openxmlformats.org/wordprocessingml/2006/main" xmlns:w14="http://schemas.microsoft.com/office/word/2010/wordml" xmlns:w15="http://schemas.microsoft.com/office/word/2012/wordml" xmlns:w16cex="http://schemas.microsoft.com/office/word/2018/wordml/cex" xmlns:w16cid="http://schemas.microsoft.com/office/word/2016/wordml/cid" xmlns:w16="http://schemas.microsoft.com/office/word/2018/wordml" xmlns:w16sdtdh="http://schemas.microsoft.com/office/word/2020/wordml/sdtdatahash" xmlns:w16se="http://schemas.microsoft.com/office/word/2015/wordml/symex" xmlns:wpg="http://schemas.microsoft.com/office/word/2010/wordprocessingGroup" xmlns:wpi="http://schemas.microsoft.com/office/word/2010/wordprocessingInk" xmlns:wne="http://schemas.microsoft.com/office/word/2006/wordml" xmlns:wps="http://schemas.microsoft.com/office/word/2010/wordprocessingShape" mc:Ignorable="w14 w15 w16se w16cid w16 w16cex w16sdtdh wp14">
   <w:footnote w:type="separator" w:id="-1">
     <w:p>
       <w:pPr>
@@ -7501,7 +8233,7 @@
 </file>
 
 <file path=word/header1.xml><?xml version="1.0" encoding="utf-8"?>
-<w:hdr xmlns:wpc="http://schemas.microsoft.com/office/word/2010/wordprocessingCanvas" xmlns:cx="http://schemas.microsoft.com/office/drawing/2014/chartex" xmlns:cx1="http://schemas.microsoft.com/office/drawing/2015/9/8/chartex" xmlns:cx2="http://schemas.microsoft.com/office/drawing/2015/10/21/chartex" xmlns:cx3="http://schemas.microsoft.com/office/drawing/2016/5/9/chartex" xmlns:cx4="http://schemas.microsoft.com/office/drawing/2016/5/10/chartex" xmlns:cx5="http://schemas.microsoft.com/office/drawing/2016/5/11/chartex" xmlns:cx6="http://schemas.microsoft.com/office/drawing/2016/5/12/chartex" xmlns:cx7="http://schemas.microsoft.com/office/drawing/2016/5/13/chartex" xmlns:cx8="http://schemas.microsoft.com/office/drawing/2016/5/14/chartex" xmlns:mc="http://schemas.openxmlformats.org/markup-compatibility/2006" xmlns:aink="http://schemas.microsoft.com/office/drawing/2016/ink" xmlns:am3d="http://schemas.microsoft.com/office/drawing/2017/model3d" xmlns:o="urn:schemas-microsoft-com:office:office" xmlns:oel="http://schemas.microsoft.com/office/2019/extlst" xmlns:r="http://schemas.openxmlformats.org/officeDocument/2006/relationships" xmlns:m="http://schemas.openxmlformats.org/officeDocument/2006/math" xmlns:v="urn:schemas-microsoft-com:vml" xmlns:wp14="http://schemas.microsoft.com/office/word/2010/wordprocessingDrawing" xmlns:wp="http://schemas.openxmlformats.org/drawingml/2006/wordprocessingDrawing" xmlns:w10="urn:schemas-microsoft-com:office:word" xmlns:w="http://schemas.openxmlformats.org/wordprocessingml/2006/main" xmlns:w14="http://schemas.microsoft.com/office/word/2010/wordml" xmlns:w15="http://schemas.microsoft.com/office/word/2012/wordml" xmlns:w16cex="http://schemas.microsoft.com/office/word/2018/wordml/cex" xmlns:w16cid="http://schemas.microsoft.com/office/word/2016/wordml/cid" xmlns:w16="http://schemas.microsoft.com/office/word/2018/wordml" xmlns:w16du="http://schemas.microsoft.com/office/word/2023/wordml/word16du" xmlns:w16sdtdh="http://schemas.microsoft.com/office/word/2020/wordml/sdtdatahash" xmlns:w16sdtfl="http://schemas.microsoft.com/office/word/2024/wordml/sdtformatlock" xmlns:w16se="http://schemas.microsoft.com/office/word/2015/wordml/symex" xmlns:wpg="http://schemas.microsoft.com/office/word/2010/wordprocessingGroup" xmlns:wpi="http://schemas.microsoft.com/office/word/2010/wordprocessingInk" xmlns:wne="http://schemas.microsoft.com/office/word/2006/wordml" xmlns:wps="http://schemas.microsoft.com/office/word/2010/wordprocessingShape" mc:Ignorable="w14 w15 w16se w16cid w16 w16cex w16sdtdh w16sdtfl w16du wp14">
+<w:hdr xmlns:wpc="http://schemas.microsoft.com/office/word/2010/wordprocessingCanvas" xmlns:cx="http://schemas.microsoft.com/office/drawing/2014/chartex" xmlns:cx1="http://schemas.microsoft.com/office/drawing/2015/9/8/chartex" xmlns:cx2="http://schemas.microsoft.com/office/drawing/2015/10/21/chartex" xmlns:cx3="http://schemas.microsoft.com/office/drawing/2016/5/9/chartex" xmlns:cx4="http://schemas.microsoft.com/office/drawing/2016/5/10/chartex" xmlns:cx5="http://schemas.microsoft.com/office/drawing/2016/5/11/chartex" xmlns:cx6="http://schemas.microsoft.com/office/drawing/2016/5/12/chartex" xmlns:cx7="http://schemas.microsoft.com/office/drawing/2016/5/13/chartex" xmlns:cx8="http://schemas.microsoft.com/office/drawing/2016/5/14/chartex" xmlns:mc="http://schemas.openxmlformats.org/markup-compatibility/2006" xmlns:aink="http://schemas.microsoft.com/office/drawing/2016/ink" xmlns:am3d="http://schemas.microsoft.com/office/drawing/2017/model3d" xmlns:o="urn:schemas-microsoft-com:office:office" xmlns:r="http://schemas.openxmlformats.org/officeDocument/2006/relationships" xmlns:m="http://schemas.openxmlformats.org/officeDocument/2006/math" xmlns:v="urn:schemas-microsoft-com:vml" xmlns:wp14="http://schemas.microsoft.com/office/word/2010/wordprocessingDrawing" xmlns:wp="http://schemas.openxmlformats.org/drawingml/2006/wordprocessingDrawing" xmlns:w10="urn:schemas-microsoft-com:office:word" xmlns:w="http://schemas.openxmlformats.org/wordprocessingml/2006/main" xmlns:w14="http://schemas.microsoft.com/office/word/2010/wordml" xmlns:w15="http://schemas.microsoft.com/office/word/2012/wordml" xmlns:w16cex="http://schemas.microsoft.com/office/word/2018/wordml/cex" xmlns:w16cid="http://schemas.microsoft.com/office/word/2016/wordml/cid" xmlns:w16="http://schemas.microsoft.com/office/word/2018/wordml" xmlns:w16sdtdh="http://schemas.microsoft.com/office/word/2020/wordml/sdtdatahash" xmlns:w16se="http://schemas.microsoft.com/office/word/2015/wordml/symex" xmlns:wpg="http://schemas.microsoft.com/office/word/2010/wordprocessingGroup" xmlns:wpi="http://schemas.microsoft.com/office/word/2010/wordprocessingInk" xmlns:wne="http://schemas.microsoft.com/office/word/2006/wordml" xmlns:wps="http://schemas.microsoft.com/office/word/2010/wordprocessingShape" mc:Ignorable="w14 w15 w16se w16cid w16 w16cex w16sdtdh wp14">
   <w:p>
     <w:pPr>
       <w:pStyle w:val="Header"/>
@@ -7624,7 +8356,7 @@
 </file>
 
 <file path=word/numbering.xml><?xml version="1.0" encoding="utf-8"?>
-<w:numbering xmlns:wpc="http://schemas.microsoft.com/office/word/2010/wordprocessingCanvas" xmlns:cx="http://schemas.microsoft.com/office/drawing/2014/chartex" xmlns:cx1="http://schemas.microsoft.com/office/drawing/2015/9/8/chartex" xmlns:cx2="http://schemas.microsoft.com/office/drawing/2015/10/21/chartex" xmlns:cx3="http://schemas.microsoft.com/office/drawing/2016/5/9/chartex" xmlns:cx4="http://schemas.microsoft.com/office/drawing/2016/5/10/chartex" xmlns:cx5="http://schemas.microsoft.com/office/drawing/2016/5/11/chartex" xmlns:cx6="http://schemas.microsoft.com/office/drawing/2016/5/12/chartex" xmlns:cx7="http://schemas.microsoft.com/office/drawing/2016/5/13/chartex" xmlns:cx8="http://schemas.microsoft.com/office/drawing/2016/5/14/chartex" xmlns:mc="http://schemas.openxmlformats.org/markup-compatibility/2006" xmlns:aink="http://schemas.microsoft.com/office/drawing/2016/ink" xmlns:am3d="http://schemas.microsoft.com/office/drawing/2017/model3d" xmlns:o="urn:schemas-microsoft-com:office:office" xmlns:oel="http://schemas.microsoft.com/office/2019/extlst" xmlns:r="http://schemas.openxmlformats.org/officeDocument/2006/relationships" xmlns:m="http://schemas.openxmlformats.org/officeDocument/2006/math" xmlns:v="urn:schemas-microsoft-com:vml" xmlns:wp14="http://schemas.microsoft.com/office/word/2010/wordprocessingDrawing" xmlns:wp="http://schemas.openxmlformats.org/drawingml/2006/wordprocessingDrawing" xmlns:w10="urn:schemas-microsoft-com:office:word" xmlns:w="http://schemas.openxmlformats.org/wordprocessingml/2006/main" xmlns:w14="http://schemas.microsoft.com/office/word/2010/wordml" xmlns:w15="http://schemas.microsoft.com/office/word/2012/wordml" xmlns:w16cex="http://schemas.microsoft.com/office/word/2018/wordml/cex" xmlns:w16cid="http://schemas.microsoft.com/office/word/2016/wordml/cid" xmlns:w16="http://schemas.microsoft.com/office/word/2018/wordml" xmlns:w16du="http://schemas.microsoft.com/office/word/2023/wordml/word16du" xmlns:w16sdtdh="http://schemas.microsoft.com/office/word/2020/wordml/sdtdatahash" xmlns:w16sdtfl="http://schemas.microsoft.com/office/word/2024/wordml/sdtformatlock" xmlns:w16se="http://schemas.microsoft.com/office/word/2015/wordml/symex" xmlns:wpg="http://schemas.microsoft.com/office/word/2010/wordprocessingGroup" xmlns:wpi="http://schemas.microsoft.com/office/word/2010/wordprocessingInk" xmlns:wne="http://schemas.microsoft.com/office/word/2006/wordml" xmlns:wps="http://schemas.microsoft.com/office/word/2010/wordprocessingShape" mc:Ignorable="w14 w15 w16se w16cid w16 w16cex w16sdtdh w16sdtfl w16du wp14">
+<w:numbering xmlns:wpc="http://schemas.microsoft.com/office/word/2010/wordprocessingCanvas" xmlns:cx="http://schemas.microsoft.com/office/drawing/2014/chartex" xmlns:cx1="http://schemas.microsoft.com/office/drawing/2015/9/8/chartex" xmlns:cx2="http://schemas.microsoft.com/office/drawing/2015/10/21/chartex" xmlns:cx3="http://schemas.microsoft.com/office/drawing/2016/5/9/chartex" xmlns:cx4="http://schemas.microsoft.com/office/drawing/2016/5/10/chartex" xmlns:cx5="http://schemas.microsoft.com/office/drawing/2016/5/11/chartex" xmlns:cx6="http://schemas.microsoft.com/office/drawing/2016/5/12/chartex" xmlns:cx7="http://schemas.microsoft.com/office/drawing/2016/5/13/chartex" xmlns:cx8="http://schemas.microsoft.com/office/drawing/2016/5/14/chartex" xmlns:mc="http://schemas.openxmlformats.org/markup-compatibility/2006" xmlns:aink="http://schemas.microsoft.com/office/drawing/2016/ink" xmlns:am3d="http://schemas.microsoft.com/office/drawing/2017/model3d" xmlns:o="urn:schemas-microsoft-com:office:office" xmlns:r="http://schemas.openxmlformats.org/officeDocument/2006/relationships" xmlns:m="http://schemas.openxmlformats.org/officeDocument/2006/math" xmlns:v="urn:schemas-microsoft-com:vml" xmlns:wp14="http://schemas.microsoft.com/office/word/2010/wordprocessingDrawing" xmlns:wp="http://schemas.openxmlformats.org/drawingml/2006/wordprocessingDrawing" xmlns:w10="urn:schemas-microsoft-com:office:word" xmlns:w="http://schemas.openxmlformats.org/wordprocessingml/2006/main" xmlns:w14="http://schemas.microsoft.com/office/word/2010/wordml" xmlns:w15="http://schemas.microsoft.com/office/word/2012/wordml" xmlns:w16cex="http://schemas.microsoft.com/office/word/2018/wordml/cex" xmlns:w16cid="http://schemas.microsoft.com/office/word/2016/wordml/cid" xmlns:w16="http://schemas.microsoft.com/office/word/2018/wordml" xmlns:w16sdtdh="http://schemas.microsoft.com/office/word/2020/wordml/sdtdatahash" xmlns:w16se="http://schemas.microsoft.com/office/word/2015/wordml/symex" xmlns:wpg="http://schemas.microsoft.com/office/word/2010/wordprocessingGroup" xmlns:wpi="http://schemas.microsoft.com/office/word/2010/wordprocessingInk" xmlns:wne="http://schemas.microsoft.com/office/word/2006/wordml" xmlns:wps="http://schemas.microsoft.com/office/word/2010/wordprocessingShape" mc:Ignorable="w14 w15 w16se w16cid w16 w16cex w16sdtdh wp14">
   <w:abstractNum w:abstractNumId="0" w15:restartNumberingAfterBreak="0">
     <w:nsid w:val="003F1C53"/>
     <w:multiLevelType w:val="multilevel"/>
@@ -7739,6 +8471,155 @@
     </w:lvl>
   </w:abstractNum>
   <w:abstractNum w:abstractNumId="1" w15:restartNumberingAfterBreak="0">
+    <w:nsid w:val="013E5246"/>
+    <w:multiLevelType w:val="multilevel"/>
+    <w:tmpl w:val="F93AC87A"/>
+    <w:lvl w:ilvl="0">
+      <w:start w:val="1"/>
+      <w:numFmt w:val="bullet"/>
+      <w:lvlText w:val=""/>
+      <w:lvlJc w:val="left"/>
+      <w:pPr>
+        <w:tabs>
+          <w:tab w:val="num" w:pos="720"/>
+        </w:tabs>
+        <w:ind w:left="720" w:hanging="360"/>
+      </w:pPr>
+      <w:rPr>
+        <w:rFonts w:ascii="Symbol" w:hAnsi="Symbol" w:hint="default"/>
+        <w:sz w:val="20"/>
+      </w:rPr>
+    </w:lvl>
+    <w:lvl w:ilvl="1">
+      <w:start w:val="1"/>
+      <w:numFmt w:val="bullet"/>
+      <w:lvlText w:val="o"/>
+      <w:lvlJc w:val="left"/>
+      <w:pPr>
+        <w:tabs>
+          <w:tab w:val="num" w:pos="1440"/>
+        </w:tabs>
+        <w:ind w:left="1440" w:hanging="360"/>
+      </w:pPr>
+      <w:rPr>
+        <w:rFonts w:ascii="Courier New" w:hAnsi="Courier New" w:hint="default"/>
+        <w:sz w:val="20"/>
+      </w:rPr>
+    </w:lvl>
+    <w:lvl w:ilvl="2" w:tentative="1">
+      <w:start w:val="1"/>
+      <w:numFmt w:val="bullet"/>
+      <w:lvlText w:val=""/>
+      <w:lvlJc w:val="left"/>
+      <w:pPr>
+        <w:tabs>
+          <w:tab w:val="num" w:pos="2160"/>
+        </w:tabs>
+        <w:ind w:left="2160" w:hanging="360"/>
+      </w:pPr>
+      <w:rPr>
+        <w:rFonts w:ascii="Wingdings" w:hAnsi="Wingdings" w:hint="default"/>
+        <w:sz w:val="20"/>
+      </w:rPr>
+    </w:lvl>
+    <w:lvl w:ilvl="3" w:tentative="1">
+      <w:start w:val="1"/>
+      <w:numFmt w:val="bullet"/>
+      <w:lvlText w:val=""/>
+      <w:lvlJc w:val="left"/>
+      <w:pPr>
+        <w:tabs>
+          <w:tab w:val="num" w:pos="2880"/>
+        </w:tabs>
+        <w:ind w:left="2880" w:hanging="360"/>
+      </w:pPr>
+      <w:rPr>
+        <w:rFonts w:ascii="Wingdings" w:hAnsi="Wingdings" w:hint="default"/>
+        <w:sz w:val="20"/>
+      </w:rPr>
+    </w:lvl>
+    <w:lvl w:ilvl="4" w:tentative="1">
+      <w:start w:val="1"/>
+      <w:numFmt w:val="bullet"/>
+      <w:lvlText w:val=""/>
+      <w:lvlJc w:val="left"/>
+      <w:pPr>
+        <w:tabs>
+          <w:tab w:val="num" w:pos="3600"/>
+        </w:tabs>
+        <w:ind w:left="3600" w:hanging="360"/>
+      </w:pPr>
+      <w:rPr>
+        <w:rFonts w:ascii="Wingdings" w:hAnsi="Wingdings" w:hint="default"/>
+        <w:sz w:val="20"/>
+      </w:rPr>
+    </w:lvl>
+    <w:lvl w:ilvl="5" w:tentative="1">
+      <w:start w:val="1"/>
+      <w:numFmt w:val="bullet"/>
+      <w:lvlText w:val=""/>
+      <w:lvlJc w:val="left"/>
+      <w:pPr>
+        <w:tabs>
+          <w:tab w:val="num" w:pos="4320"/>
+        </w:tabs>
+        <w:ind w:left="4320" w:hanging="360"/>
+      </w:pPr>
+      <w:rPr>
+        <w:rFonts w:ascii="Wingdings" w:hAnsi="Wingdings" w:hint="default"/>
+        <w:sz w:val="20"/>
+      </w:rPr>
+    </w:lvl>
+    <w:lvl w:ilvl="6" w:tentative="1">
+      <w:start w:val="1"/>
+      <w:numFmt w:val="bullet"/>
+      <w:lvlText w:val=""/>
+      <w:lvlJc w:val="left"/>
+      <w:pPr>
+        <w:tabs>
+          <w:tab w:val="num" w:pos="5040"/>
+        </w:tabs>
+        <w:ind w:left="5040" w:hanging="360"/>
+      </w:pPr>
+      <w:rPr>
+        <w:rFonts w:ascii="Wingdings" w:hAnsi="Wingdings" w:hint="default"/>
+        <w:sz w:val="20"/>
+      </w:rPr>
+    </w:lvl>
+    <w:lvl w:ilvl="7" w:tentative="1">
+      <w:start w:val="1"/>
+      <w:numFmt w:val="bullet"/>
+      <w:lvlText w:val=""/>
+      <w:lvlJc w:val="left"/>
+      <w:pPr>
+        <w:tabs>
+          <w:tab w:val="num" w:pos="5760"/>
+        </w:tabs>
+        <w:ind w:left="5760" w:hanging="360"/>
+      </w:pPr>
+      <w:rPr>
+        <w:rFonts w:ascii="Wingdings" w:hAnsi="Wingdings" w:hint="default"/>
+        <w:sz w:val="20"/>
+      </w:rPr>
+    </w:lvl>
+    <w:lvl w:ilvl="8" w:tentative="1">
+      <w:start w:val="1"/>
+      <w:numFmt w:val="bullet"/>
+      <w:lvlText w:val=""/>
+      <w:lvlJc w:val="left"/>
+      <w:pPr>
+        <w:tabs>
+          <w:tab w:val="num" w:pos="6480"/>
+        </w:tabs>
+        <w:ind w:left="6480" w:hanging="360"/>
+      </w:pPr>
+      <w:rPr>
+        <w:rFonts w:ascii="Wingdings" w:hAnsi="Wingdings" w:hint="default"/>
+        <w:sz w:val="20"/>
+      </w:rPr>
+    </w:lvl>
+  </w:abstractNum>
+  <w:abstractNum w:abstractNumId="2" w15:restartNumberingAfterBreak="0">
     <w:nsid w:val="03464A59"/>
     <w:multiLevelType w:val="hybridMultilevel"/>
     <w:tmpl w:val="05BEACA8"/>
@@ -7851,7 +8732,7 @@
       </w:rPr>
     </w:lvl>
   </w:abstractNum>
-  <w:abstractNum w:abstractNumId="2" w15:restartNumberingAfterBreak="0">
+  <w:abstractNum w:abstractNumId="3" w15:restartNumberingAfterBreak="0">
     <w:nsid w:val="0D022C1E"/>
     <w:multiLevelType w:val="multilevel"/>
     <w:tmpl w:val="660E82CA"/>
@@ -8000,7 +8881,156 @@
       </w:rPr>
     </w:lvl>
   </w:abstractNum>
-  <w:abstractNum w:abstractNumId="3" w15:restartNumberingAfterBreak="0">
+  <w:abstractNum w:abstractNumId="4" w15:restartNumberingAfterBreak="0">
+    <w:nsid w:val="10523D0B"/>
+    <w:multiLevelType w:val="multilevel"/>
+    <w:tmpl w:val="201426F0"/>
+    <w:lvl w:ilvl="0">
+      <w:start w:val="1"/>
+      <w:numFmt w:val="bullet"/>
+      <w:lvlText w:val=""/>
+      <w:lvlJc w:val="left"/>
+      <w:pPr>
+        <w:tabs>
+          <w:tab w:val="num" w:pos="720"/>
+        </w:tabs>
+        <w:ind w:left="720" w:hanging="360"/>
+      </w:pPr>
+      <w:rPr>
+        <w:rFonts w:ascii="Symbol" w:hAnsi="Symbol" w:hint="default"/>
+        <w:sz w:val="20"/>
+      </w:rPr>
+    </w:lvl>
+    <w:lvl w:ilvl="1">
+      <w:start w:val="1"/>
+      <w:numFmt w:val="bullet"/>
+      <w:lvlText w:val="o"/>
+      <w:lvlJc w:val="left"/>
+      <w:pPr>
+        <w:tabs>
+          <w:tab w:val="num" w:pos="1440"/>
+        </w:tabs>
+        <w:ind w:left="1440" w:hanging="360"/>
+      </w:pPr>
+      <w:rPr>
+        <w:rFonts w:ascii="Courier New" w:hAnsi="Courier New" w:hint="default"/>
+        <w:sz w:val="20"/>
+      </w:rPr>
+    </w:lvl>
+    <w:lvl w:ilvl="2" w:tentative="1">
+      <w:start w:val="1"/>
+      <w:numFmt w:val="bullet"/>
+      <w:lvlText w:val=""/>
+      <w:lvlJc w:val="left"/>
+      <w:pPr>
+        <w:tabs>
+          <w:tab w:val="num" w:pos="2160"/>
+        </w:tabs>
+        <w:ind w:left="2160" w:hanging="360"/>
+      </w:pPr>
+      <w:rPr>
+        <w:rFonts w:ascii="Wingdings" w:hAnsi="Wingdings" w:hint="default"/>
+        <w:sz w:val="20"/>
+      </w:rPr>
+    </w:lvl>
+    <w:lvl w:ilvl="3" w:tentative="1">
+      <w:start w:val="1"/>
+      <w:numFmt w:val="bullet"/>
+      <w:lvlText w:val=""/>
+      <w:lvlJc w:val="left"/>
+      <w:pPr>
+        <w:tabs>
+          <w:tab w:val="num" w:pos="2880"/>
+        </w:tabs>
+        <w:ind w:left="2880" w:hanging="360"/>
+      </w:pPr>
+      <w:rPr>
+        <w:rFonts w:ascii="Wingdings" w:hAnsi="Wingdings" w:hint="default"/>
+        <w:sz w:val="20"/>
+      </w:rPr>
+    </w:lvl>
+    <w:lvl w:ilvl="4" w:tentative="1">
+      <w:start w:val="1"/>
+      <w:numFmt w:val="bullet"/>
+      <w:lvlText w:val=""/>
+      <w:lvlJc w:val="left"/>
+      <w:pPr>
+        <w:tabs>
+          <w:tab w:val="num" w:pos="3600"/>
+        </w:tabs>
+        <w:ind w:left="3600" w:hanging="360"/>
+      </w:pPr>
+      <w:rPr>
+        <w:rFonts w:ascii="Wingdings" w:hAnsi="Wingdings" w:hint="default"/>
+        <w:sz w:val="20"/>
+      </w:rPr>
+    </w:lvl>
+    <w:lvl w:ilvl="5" w:tentative="1">
+      <w:start w:val="1"/>
+      <w:numFmt w:val="bullet"/>
+      <w:lvlText w:val=""/>
+      <w:lvlJc w:val="left"/>
+      <w:pPr>
+        <w:tabs>
+          <w:tab w:val="num" w:pos="4320"/>
+        </w:tabs>
+        <w:ind w:left="4320" w:hanging="360"/>
+      </w:pPr>
+      <w:rPr>
+        <w:rFonts w:ascii="Wingdings" w:hAnsi="Wingdings" w:hint="default"/>
+        <w:sz w:val="20"/>
+      </w:rPr>
+    </w:lvl>
+    <w:lvl w:ilvl="6" w:tentative="1">
+      <w:start w:val="1"/>
+      <w:numFmt w:val="bullet"/>
+      <w:lvlText w:val=""/>
+      <w:lvlJc w:val="left"/>
+      <w:pPr>
+        <w:tabs>
+          <w:tab w:val="num" w:pos="5040"/>
+        </w:tabs>
+        <w:ind w:left="5040" w:hanging="360"/>
+      </w:pPr>
+      <w:rPr>
+        <w:rFonts w:ascii="Wingdings" w:hAnsi="Wingdings" w:hint="default"/>
+        <w:sz w:val="20"/>
+      </w:rPr>
+    </w:lvl>
+    <w:lvl w:ilvl="7" w:tentative="1">
+      <w:start w:val="1"/>
+      <w:numFmt w:val="bullet"/>
+      <w:lvlText w:val=""/>
+      <w:lvlJc w:val="left"/>
+      <w:pPr>
+        <w:tabs>
+          <w:tab w:val="num" w:pos="5760"/>
+        </w:tabs>
+        <w:ind w:left="5760" w:hanging="360"/>
+      </w:pPr>
+      <w:rPr>
+        <w:rFonts w:ascii="Wingdings" w:hAnsi="Wingdings" w:hint="default"/>
+        <w:sz w:val="20"/>
+      </w:rPr>
+    </w:lvl>
+    <w:lvl w:ilvl="8" w:tentative="1">
+      <w:start w:val="1"/>
+      <w:numFmt w:val="bullet"/>
+      <w:lvlText w:val=""/>
+      <w:lvlJc w:val="left"/>
+      <w:pPr>
+        <w:tabs>
+          <w:tab w:val="num" w:pos="6480"/>
+        </w:tabs>
+        <w:ind w:left="6480" w:hanging="360"/>
+      </w:pPr>
+      <w:rPr>
+        <w:rFonts w:ascii="Wingdings" w:hAnsi="Wingdings" w:hint="default"/>
+        <w:sz w:val="20"/>
+      </w:rPr>
+    </w:lvl>
+  </w:abstractNum>
+  <w:abstractNum w:abstractNumId="5" w15:restartNumberingAfterBreak="0">
     <w:nsid w:val="159E1317"/>
     <w:multiLevelType w:val="hybridMultilevel"/>
     <w:tmpl w:val="0F0ECD1C"/>
@@ -8113,7 +9143,7 @@
       </w:rPr>
     </w:lvl>
   </w:abstractNum>
-  <w:abstractNum w:abstractNumId="4" w15:restartNumberingAfterBreak="0">
+  <w:abstractNum w:abstractNumId="6" w15:restartNumberingAfterBreak="0">
     <w:nsid w:val="1ADF1CF9"/>
     <w:multiLevelType w:val="multilevel"/>
     <w:tmpl w:val="67384256"/>
@@ -8262,7 +9292,7 @@
       </w:rPr>
     </w:lvl>
   </w:abstractNum>
-  <w:abstractNum w:abstractNumId="5" w15:restartNumberingAfterBreak="0">
+  <w:abstractNum w:abstractNumId="7" w15:restartNumberingAfterBreak="0">
     <w:nsid w:val="1D1F71CE"/>
     <w:multiLevelType w:val="multilevel"/>
     <w:tmpl w:val="67DA92CC"/>
@@ -8411,7 +9441,7 @@
       </w:rPr>
     </w:lvl>
   </w:abstractNum>
-  <w:abstractNum w:abstractNumId="6" w15:restartNumberingAfterBreak="0">
+  <w:abstractNum w:abstractNumId="8" w15:restartNumberingAfterBreak="0">
     <w:nsid w:val="1F163B1B"/>
     <w:multiLevelType w:val="multilevel"/>
     <w:tmpl w:val="5852AE80"/>
@@ -8560,7 +9590,7 @@
       </w:rPr>
     </w:lvl>
   </w:abstractNum>
-  <w:abstractNum w:abstractNumId="7" w15:restartNumberingAfterBreak="0">
+  <w:abstractNum w:abstractNumId="9" w15:restartNumberingAfterBreak="0">
     <w:nsid w:val="220B3BDB"/>
     <w:multiLevelType w:val="multilevel"/>
     <w:tmpl w:val="187CA2FE"/>
@@ -8709,7 +9739,7 @@
       </w:rPr>
     </w:lvl>
   </w:abstractNum>
-  <w:abstractNum w:abstractNumId="8" w15:restartNumberingAfterBreak="0">
+  <w:abstractNum w:abstractNumId="10" w15:restartNumberingAfterBreak="0">
     <w:nsid w:val="24DC55A9"/>
     <w:multiLevelType w:val="multilevel"/>
     <w:tmpl w:val="E2D2276A"/>
@@ -8858,7 +9888,156 @@
       </w:rPr>
     </w:lvl>
   </w:abstractNum>
-  <w:abstractNum w:abstractNumId="9" w15:restartNumberingAfterBreak="0">
+  <w:abstractNum w:abstractNumId="11" w15:restartNumberingAfterBreak="0">
+    <w:nsid w:val="28B27853"/>
+    <w:multiLevelType w:val="multilevel"/>
+    <w:tmpl w:val="CA12BA28"/>
+    <w:lvl w:ilvl="0">
+      <w:start w:val="1"/>
+      <w:numFmt w:val="bullet"/>
+      <w:lvlText w:val=""/>
+      <w:lvlJc w:val="left"/>
+      <w:pPr>
+        <w:tabs>
+          <w:tab w:val="num" w:pos="720"/>
+        </w:tabs>
+        <w:ind w:left="720" w:hanging="360"/>
+      </w:pPr>
+      <w:rPr>
+        <w:rFonts w:ascii="Symbol" w:hAnsi="Symbol" w:hint="default"/>
+        <w:sz w:val="20"/>
+      </w:rPr>
+    </w:lvl>
+    <w:lvl w:ilvl="1" w:tentative="1">
+      <w:start w:val="1"/>
+      <w:numFmt w:val="bullet"/>
+      <w:lvlText w:val="o"/>
+      <w:lvlJc w:val="left"/>
+      <w:pPr>
+        <w:tabs>
+          <w:tab w:val="num" w:pos="1440"/>
+        </w:tabs>
+        <w:ind w:left="1440" w:hanging="360"/>
+      </w:pPr>
+      <w:rPr>
+        <w:rFonts w:ascii="Courier New" w:hAnsi="Courier New" w:hint="default"/>
+        <w:sz w:val="20"/>
+      </w:rPr>
+    </w:lvl>
+    <w:lvl w:ilvl="2" w:tentative="1">
+      <w:start w:val="1"/>
+      <w:numFmt w:val="bullet"/>
+      <w:lvlText w:val=""/>
+      <w:lvlJc w:val="left"/>
+      <w:pPr>
+        <w:tabs>
+          <w:tab w:val="num" w:pos="2160"/>
+        </w:tabs>
+        <w:ind w:left="2160" w:hanging="360"/>
+      </w:pPr>
+      <w:rPr>
+        <w:rFonts w:ascii="Wingdings" w:hAnsi="Wingdings" w:hint="default"/>
+        <w:sz w:val="20"/>
+      </w:rPr>
+    </w:lvl>
+    <w:lvl w:ilvl="3" w:tentative="1">
+      <w:start w:val="1"/>
+      <w:numFmt w:val="bullet"/>
+      <w:lvlText w:val=""/>
+      <w:lvlJc w:val="left"/>
+      <w:pPr>
+        <w:tabs>
+          <w:tab w:val="num" w:pos="2880"/>
+        </w:tabs>
+        <w:ind w:left="2880" w:hanging="360"/>
+      </w:pPr>
+      <w:rPr>
+        <w:rFonts w:ascii="Wingdings" w:hAnsi="Wingdings" w:hint="default"/>
+        <w:sz w:val="20"/>
+      </w:rPr>
+    </w:lvl>
+    <w:lvl w:ilvl="4" w:tentative="1">
+      <w:start w:val="1"/>
+      <w:numFmt w:val="bullet"/>
+      <w:lvlText w:val=""/>
+      <w:lvlJc w:val="left"/>
+      <w:pPr>
+        <w:tabs>
+          <w:tab w:val="num" w:pos="3600"/>
+        </w:tabs>
+        <w:ind w:left="3600" w:hanging="360"/>
+      </w:pPr>
+      <w:rPr>
+        <w:rFonts w:ascii="Wingdings" w:hAnsi="Wingdings" w:hint="default"/>
+        <w:sz w:val="20"/>
+      </w:rPr>
+    </w:lvl>
+    <w:lvl w:ilvl="5" w:tentative="1">
+      <w:start w:val="1"/>
+      <w:numFmt w:val="bullet"/>
+      <w:lvlText w:val=""/>
+      <w:lvlJc w:val="left"/>
+      <w:pPr>
+        <w:tabs>
+          <w:tab w:val="num" w:pos="4320"/>
+        </w:tabs>
+        <w:ind w:left="4320" w:hanging="360"/>
+      </w:pPr>
+      <w:rPr>
+        <w:rFonts w:ascii="Wingdings" w:hAnsi="Wingdings" w:hint="default"/>
+        <w:sz w:val="20"/>
+      </w:rPr>
+    </w:lvl>
+    <w:lvl w:ilvl="6" w:tentative="1">
+      <w:start w:val="1"/>
+      <w:numFmt w:val="bullet"/>
+      <w:lvlText w:val=""/>
+      <w:lvlJc w:val="left"/>
+      <w:pPr>
+        <w:tabs>
+          <w:tab w:val="num" w:pos="5040"/>
+        </w:tabs>
+        <w:ind w:left="5040" w:hanging="360"/>
+      </w:pPr>
+      <w:rPr>
+        <w:rFonts w:ascii="Wingdings" w:hAnsi="Wingdings" w:hint="default"/>
+        <w:sz w:val="20"/>
+      </w:rPr>
+    </w:lvl>
+    <w:lvl w:ilvl="7" w:tentative="1">
+      <w:start w:val="1"/>
+      <w:numFmt w:val="bullet"/>
+      <w:lvlText w:val=""/>
+      <w:lvlJc w:val="left"/>
+      <w:pPr>
+        <w:tabs>
+          <w:tab w:val="num" w:pos="5760"/>
+        </w:tabs>
+        <w:ind w:left="5760" w:hanging="360"/>
+      </w:pPr>
+      <w:rPr>
+        <w:rFonts w:ascii="Wingdings" w:hAnsi="Wingdings" w:hint="default"/>
+        <w:sz w:val="20"/>
+      </w:rPr>
+    </w:lvl>
+    <w:lvl w:ilvl="8" w:tentative="1">
+      <w:start w:val="1"/>
+      <w:numFmt w:val="bullet"/>
+      <w:lvlText w:val=""/>
+      <w:lvlJc w:val="left"/>
+      <w:pPr>
+        <w:tabs>
+          <w:tab w:val="num" w:pos="6480"/>
+        </w:tabs>
+        <w:ind w:left="6480" w:hanging="360"/>
+      </w:pPr>
+      <w:rPr>
+        <w:rFonts w:ascii="Wingdings" w:hAnsi="Wingdings" w:hint="default"/>
+        <w:sz w:val="20"/>
+      </w:rPr>
+    </w:lvl>
+  </w:abstractNum>
+  <w:abstractNum w:abstractNumId="12" w15:restartNumberingAfterBreak="0">
     <w:nsid w:val="2EAA5A11"/>
     <w:multiLevelType w:val="multilevel"/>
     <w:tmpl w:val="2618D82C"/>
@@ -9007,7 +10186,7 @@
       </w:rPr>
     </w:lvl>
   </w:abstractNum>
-  <w:abstractNum w:abstractNumId="10" w15:restartNumberingAfterBreak="0">
+  <w:abstractNum w:abstractNumId="13" w15:restartNumberingAfterBreak="0">
     <w:nsid w:val="31E31730"/>
     <w:multiLevelType w:val="multilevel"/>
     <w:tmpl w:val="5F941440"/>
@@ -9156,7 +10335,7 @@
       </w:rPr>
     </w:lvl>
   </w:abstractNum>
-  <w:abstractNum w:abstractNumId="11" w15:restartNumberingAfterBreak="0">
+  <w:abstractNum w:abstractNumId="14" w15:restartNumberingAfterBreak="0">
     <w:nsid w:val="31F70292"/>
     <w:multiLevelType w:val="multilevel"/>
     <w:tmpl w:val="A514A31E"/>
@@ -9305,7 +10484,7 @@
       </w:rPr>
     </w:lvl>
   </w:abstractNum>
-  <w:abstractNum w:abstractNumId="12" w15:restartNumberingAfterBreak="0">
+  <w:abstractNum w:abstractNumId="15" w15:restartNumberingAfterBreak="0">
     <w:nsid w:val="324126AC"/>
     <w:multiLevelType w:val="multilevel"/>
     <w:tmpl w:val="7A406E1A"/>
@@ -9454,7 +10633,7 @@
       </w:rPr>
     </w:lvl>
   </w:abstractNum>
-  <w:abstractNum w:abstractNumId="13" w15:restartNumberingAfterBreak="0">
+  <w:abstractNum w:abstractNumId="16" w15:restartNumberingAfterBreak="0">
     <w:nsid w:val="3557124F"/>
     <w:multiLevelType w:val="hybridMultilevel"/>
     <w:tmpl w:val="1B7CE2E2"/>
@@ -9543,7 +10722,7 @@
       </w:pPr>
     </w:lvl>
   </w:abstractNum>
-  <w:abstractNum w:abstractNumId="14" w15:restartNumberingAfterBreak="0">
+  <w:abstractNum w:abstractNumId="17" w15:restartNumberingAfterBreak="0">
     <w:nsid w:val="35C46462"/>
     <w:multiLevelType w:val="multilevel"/>
     <w:tmpl w:val="9EE2E69A"/>
@@ -9692,7 +10871,7 @@
       </w:rPr>
     </w:lvl>
   </w:abstractNum>
-  <w:abstractNum w:abstractNumId="15" w15:restartNumberingAfterBreak="0">
+  <w:abstractNum w:abstractNumId="18" w15:restartNumberingAfterBreak="0">
     <w:nsid w:val="368F5A1E"/>
     <w:multiLevelType w:val="multilevel"/>
     <w:tmpl w:val="FF0618E8"/>
@@ -9841,7 +11020,7 @@
       </w:rPr>
     </w:lvl>
   </w:abstractNum>
-  <w:abstractNum w:abstractNumId="16" w15:restartNumberingAfterBreak="0">
+  <w:abstractNum w:abstractNumId="19" w15:restartNumberingAfterBreak="0">
     <w:nsid w:val="396232AA"/>
     <w:multiLevelType w:val="multilevel"/>
     <w:tmpl w:val="0804BD78"/>
@@ -9962,7 +11141,7 @@
       </w:rPr>
     </w:lvl>
   </w:abstractNum>
-  <w:abstractNum w:abstractNumId="17" w15:restartNumberingAfterBreak="0">
+  <w:abstractNum w:abstractNumId="20" w15:restartNumberingAfterBreak="0">
     <w:nsid w:val="3A905613"/>
     <w:multiLevelType w:val="hybridMultilevel"/>
     <w:tmpl w:val="CF2A1BC2"/>
@@ -10075,7 +11254,7 @@
       </w:rPr>
     </w:lvl>
   </w:abstractNum>
-  <w:abstractNum w:abstractNumId="18" w15:restartNumberingAfterBreak="0">
+  <w:abstractNum w:abstractNumId="21" w15:restartNumberingAfterBreak="0">
     <w:nsid w:val="3AC13A0D"/>
     <w:multiLevelType w:val="hybridMultilevel"/>
     <w:tmpl w:val="998E5A4C"/>
@@ -10188,7 +11367,7 @@
       </w:rPr>
     </w:lvl>
   </w:abstractNum>
-  <w:abstractNum w:abstractNumId="19" w15:restartNumberingAfterBreak="0">
+  <w:abstractNum w:abstractNumId="22" w15:restartNumberingAfterBreak="0">
     <w:nsid w:val="3FB11E67"/>
     <w:multiLevelType w:val="hybridMultilevel"/>
     <w:tmpl w:val="6832AB2E"/>
@@ -10301,7 +11480,7 @@
       </w:rPr>
     </w:lvl>
   </w:abstractNum>
-  <w:abstractNum w:abstractNumId="20" w15:restartNumberingAfterBreak="0">
+  <w:abstractNum w:abstractNumId="23" w15:restartNumberingAfterBreak="0">
     <w:nsid w:val="43276E4A"/>
     <w:multiLevelType w:val="hybridMultilevel"/>
     <w:tmpl w:val="D2E636E8"/>
@@ -10414,7 +11593,120 @@
       </w:rPr>
     </w:lvl>
   </w:abstractNum>
-  <w:abstractNum w:abstractNumId="21" w15:restartNumberingAfterBreak="0">
+  <w:abstractNum w:abstractNumId="24" w15:restartNumberingAfterBreak="0">
+    <w:nsid w:val="477350DC"/>
+    <w:multiLevelType w:val="hybridMultilevel"/>
+    <w:tmpl w:val="803A9C58"/>
+    <w:lvl w:ilvl="0" w:tplc="04090001">
+      <w:start w:val="1"/>
+      <w:numFmt w:val="bullet"/>
+      <w:lvlText w:val=""/>
+      <w:lvlJc w:val="left"/>
+      <w:pPr>
+        <w:ind w:left="1440" w:hanging="360"/>
+      </w:pPr>
+      <w:rPr>
+        <w:rFonts w:ascii="Symbol" w:hAnsi="Symbol" w:hint="default"/>
+      </w:rPr>
+    </w:lvl>
+    <w:lvl w:ilvl="1" w:tplc="04090003">
+      <w:start w:val="1"/>
+      <w:numFmt w:val="bullet"/>
+      <w:lvlText w:val="o"/>
+      <w:lvlJc w:val="left"/>
+      <w:pPr>
+        <w:ind w:left="2160" w:hanging="360"/>
+      </w:pPr>
+      <w:rPr>
+        <w:rFonts w:ascii="Courier New" w:hAnsi="Courier New" w:cs="Courier New" w:hint="default"/>
+      </w:rPr>
+    </w:lvl>
+    <w:lvl w:ilvl="2" w:tplc="04090005" w:tentative="1">
+      <w:start w:val="1"/>
+      <w:numFmt w:val="bullet"/>
+      <w:lvlText w:val=""/>
+      <w:lvlJc w:val="left"/>
+      <w:pPr>
+        <w:ind w:left="2880" w:hanging="360"/>
+      </w:pPr>
+      <w:rPr>
+        <w:rFonts w:ascii="Wingdings" w:hAnsi="Wingdings" w:hint="default"/>
+      </w:rPr>
+    </w:lvl>
+    <w:lvl w:ilvl="3" w:tplc="04090001" w:tentative="1">
+      <w:start w:val="1"/>
+      <w:numFmt w:val="bullet"/>
+      <w:lvlText w:val=""/>
+      <w:lvlJc w:val="left"/>
+      <w:pPr>
+        <w:ind w:left="3600" w:hanging="360"/>
+      </w:pPr>
+      <w:rPr>
+        <w:rFonts w:ascii="Symbol" w:hAnsi="Symbol" w:hint="default"/>
+      </w:rPr>
+    </w:lvl>
+    <w:lvl w:ilvl="4" w:tplc="04090003" w:tentative="1">
+      <w:start w:val="1"/>
+      <w:numFmt w:val="bullet"/>
+      <w:lvlText w:val="o"/>
+      <w:lvlJc w:val="left"/>
+      <w:pPr>
+        <w:ind w:left="4320" w:hanging="360"/>
+      </w:pPr>
+      <w:rPr>
+        <w:rFonts w:ascii="Courier New" w:hAnsi="Courier New" w:cs="Courier New" w:hint="default"/>
+      </w:rPr>
+    </w:lvl>
+    <w:lvl w:ilvl="5" w:tplc="04090005" w:tentative="1">
+      <w:start w:val="1"/>
+      <w:numFmt w:val="bullet"/>
+      <w:lvlText w:val=""/>
+      <w:lvlJc w:val="left"/>
+      <w:pPr>
+        <w:ind w:left="5040" w:hanging="360"/>
+      </w:pPr>
+      <w:rPr>
+        <w:rFonts w:ascii="Wingdings" w:hAnsi="Wingdings" w:hint="default"/>
+      </w:rPr>
+    </w:lvl>
+    <w:lvl w:ilvl="6" w:tplc="04090001" w:tentative="1">
+      <w:start w:val="1"/>
+      <w:numFmt w:val="bullet"/>
+      <w:lvlText w:val=""/>
+      <w:lvlJc w:val="left"/>
+      <w:pPr>
+        <w:ind w:left="5760" w:hanging="360"/>
+      </w:pPr>
+      <w:rPr>
+        <w:rFonts w:ascii="Symbol" w:hAnsi="Symbol" w:hint="default"/>
+      </w:rPr>
+    </w:lvl>
+    <w:lvl w:ilvl="7" w:tplc="04090003" w:tentative="1">
+      <w:start w:val="1"/>
+      <w:numFmt w:val="bullet"/>
+      <w:lvlText w:val="o"/>
+      <w:lvlJc w:val="left"/>
+      <w:pPr>
+        <w:ind w:left="6480" w:hanging="360"/>
+      </w:pPr>
+      <w:rPr>
+        <w:rFonts w:ascii="Courier New" w:hAnsi="Courier New" w:cs="Courier New" w:hint="default"/>
+      </w:rPr>
+    </w:lvl>
+    <w:lvl w:ilvl="8" w:tplc="04090005" w:tentative="1">
+      <w:start w:val="1"/>
+      <w:numFmt w:val="bullet"/>
+      <w:lvlText w:val=""/>
+      <w:lvlJc w:val="left"/>
+      <w:pPr>
+        <w:ind w:left="7200" w:hanging="360"/>
+      </w:pPr>
+      <w:rPr>
+        <w:rFonts w:ascii="Wingdings" w:hAnsi="Wingdings" w:hint="default"/>
+      </w:rPr>
+    </w:lvl>
+  </w:abstractNum>
+  <w:abstractNum w:abstractNumId="25" w15:restartNumberingAfterBreak="0">
     <w:nsid w:val="4A16700F"/>
     <w:multiLevelType w:val="hybridMultilevel"/>
     <w:tmpl w:val="8CE0FD9C"/>
@@ -10527,7 +11819,7 @@
       </w:rPr>
     </w:lvl>
   </w:abstractNum>
-  <w:abstractNum w:abstractNumId="22" w15:restartNumberingAfterBreak="0">
+  <w:abstractNum w:abstractNumId="26" w15:restartNumberingAfterBreak="0">
     <w:nsid w:val="4B304599"/>
     <w:multiLevelType w:val="multilevel"/>
     <w:tmpl w:val="A4BA1EFA"/>
@@ -10676,7 +11968,7 @@
       </w:rPr>
     </w:lvl>
   </w:abstractNum>
-  <w:abstractNum w:abstractNumId="23" w15:restartNumberingAfterBreak="0">
+  <w:abstractNum w:abstractNumId="27" w15:restartNumberingAfterBreak="0">
     <w:nsid w:val="4FFC4944"/>
     <w:multiLevelType w:val="hybridMultilevel"/>
     <w:tmpl w:val="EDF2E818"/>
@@ -10789,7 +12081,7 @@
       </w:rPr>
     </w:lvl>
   </w:abstractNum>
-  <w:abstractNum w:abstractNumId="24" w15:restartNumberingAfterBreak="0">
+  <w:abstractNum w:abstractNumId="28" w15:restartNumberingAfterBreak="0">
     <w:nsid w:val="55526F68"/>
     <w:multiLevelType w:val="hybridMultilevel"/>
     <w:tmpl w:val="73DC5D90"/>
@@ -10902,7 +12194,7 @@
       </w:rPr>
     </w:lvl>
   </w:abstractNum>
-  <w:abstractNum w:abstractNumId="25" w15:restartNumberingAfterBreak="0">
+  <w:abstractNum w:abstractNumId="29" w15:restartNumberingAfterBreak="0">
     <w:nsid w:val="55B301AC"/>
     <w:multiLevelType w:val="hybridMultilevel"/>
     <w:tmpl w:val="9AFEB2FC"/>
@@ -11015,7 +12307,7 @@
       </w:rPr>
     </w:lvl>
   </w:abstractNum>
-  <w:abstractNum w:abstractNumId="26" w15:restartNumberingAfterBreak="0">
+  <w:abstractNum w:abstractNumId="30" w15:restartNumberingAfterBreak="0">
     <w:nsid w:val="57441036"/>
     <w:multiLevelType w:val="multilevel"/>
     <w:tmpl w:val="172440E6"/>
@@ -11164,7 +12456,7 @@
       </w:rPr>
     </w:lvl>
   </w:abstractNum>
-  <w:abstractNum w:abstractNumId="27" w15:restartNumberingAfterBreak="0">
+  <w:abstractNum w:abstractNumId="31" w15:restartNumberingAfterBreak="0">
     <w:nsid w:val="5D391688"/>
     <w:multiLevelType w:val="hybridMultilevel"/>
     <w:tmpl w:val="22B85C56"/>
@@ -11277,7 +12569,7 @@
       </w:rPr>
     </w:lvl>
   </w:abstractNum>
-  <w:abstractNum w:abstractNumId="28" w15:restartNumberingAfterBreak="0">
+  <w:abstractNum w:abstractNumId="32" w15:restartNumberingAfterBreak="0">
     <w:nsid w:val="6374315E"/>
     <w:multiLevelType w:val="multilevel"/>
     <w:tmpl w:val="2EDE6D58"/>
@@ -11426,7 +12718,7 @@
       </w:rPr>
     </w:lvl>
   </w:abstractNum>
-  <w:abstractNum w:abstractNumId="29" w15:restartNumberingAfterBreak="0">
+  <w:abstractNum w:abstractNumId="33" w15:restartNumberingAfterBreak="0">
     <w:nsid w:val="64A301E5"/>
     <w:multiLevelType w:val="multilevel"/>
     <w:tmpl w:val="AF0E2208"/>
@@ -11575,7 +12867,7 @@
       </w:rPr>
     </w:lvl>
   </w:abstractNum>
-  <w:abstractNum w:abstractNumId="30" w15:restartNumberingAfterBreak="0">
+  <w:abstractNum w:abstractNumId="34" w15:restartNumberingAfterBreak="0">
     <w:nsid w:val="65861893"/>
     <w:multiLevelType w:val="hybridMultilevel"/>
     <w:tmpl w:val="0A105A28"/>
@@ -11688,7 +12980,7 @@
       </w:rPr>
     </w:lvl>
   </w:abstractNum>
-  <w:abstractNum w:abstractNumId="31" w15:restartNumberingAfterBreak="0">
+  <w:abstractNum w:abstractNumId="35" w15:restartNumberingAfterBreak="0">
     <w:nsid w:val="6F0F6452"/>
     <w:multiLevelType w:val="hybridMultilevel"/>
     <w:tmpl w:val="EC749FA6"/>
@@ -11801,7 +13093,7 @@
       </w:rPr>
     </w:lvl>
   </w:abstractNum>
-  <w:abstractNum w:abstractNumId="32" w15:restartNumberingAfterBreak="0">
+  <w:abstractNum w:abstractNumId="36" w15:restartNumberingAfterBreak="0">
     <w:nsid w:val="700F47CF"/>
     <w:multiLevelType w:val="hybridMultilevel"/>
     <w:tmpl w:val="178A51E2"/>
@@ -11914,7 +13206,7 @@
       </w:rPr>
     </w:lvl>
   </w:abstractNum>
-  <w:abstractNum w:abstractNumId="33" w15:restartNumberingAfterBreak="0">
+  <w:abstractNum w:abstractNumId="37" w15:restartNumberingAfterBreak="0">
     <w:nsid w:val="72C23B89"/>
     <w:multiLevelType w:val="hybridMultilevel"/>
     <w:tmpl w:val="77020B88"/>
@@ -12027,7 +13319,156 @@
       </w:rPr>
     </w:lvl>
   </w:abstractNum>
-  <w:abstractNum w:abstractNumId="34" w15:restartNumberingAfterBreak="0">
+  <w:abstractNum w:abstractNumId="38" w15:restartNumberingAfterBreak="0">
+    <w:nsid w:val="73636D66"/>
+    <w:multiLevelType w:val="multilevel"/>
+    <w:tmpl w:val="6EA665F0"/>
+    <w:lvl w:ilvl="0">
+      <w:start w:val="1"/>
+      <w:numFmt w:val="bullet"/>
+      <w:lvlText w:val=""/>
+      <w:lvlJc w:val="left"/>
+      <w:pPr>
+        <w:tabs>
+          <w:tab w:val="num" w:pos="720"/>
+        </w:tabs>
+        <w:ind w:left="720" w:hanging="360"/>
+      </w:pPr>
+      <w:rPr>
+        <w:rFonts w:ascii="Symbol" w:hAnsi="Symbol" w:hint="default"/>
+        <w:sz w:val="20"/>
+      </w:rPr>
+    </w:lvl>
+    <w:lvl w:ilvl="1" w:tentative="1">
+      <w:start w:val="1"/>
+      <w:numFmt w:val="bullet"/>
+      <w:lvlText w:val="o"/>
+      <w:lvlJc w:val="left"/>
+      <w:pPr>
+        <w:tabs>
+          <w:tab w:val="num" w:pos="1440"/>
+        </w:tabs>
+        <w:ind w:left="1440" w:hanging="360"/>
+      </w:pPr>
+      <w:rPr>
+        <w:rFonts w:ascii="Courier New" w:hAnsi="Courier New" w:hint="default"/>
+        <w:sz w:val="20"/>
+      </w:rPr>
+    </w:lvl>
+    <w:lvl w:ilvl="2" w:tentative="1">
+      <w:start w:val="1"/>
+      <w:numFmt w:val="bullet"/>
+      <w:lvlText w:val=""/>
+      <w:lvlJc w:val="left"/>
+      <w:pPr>
+        <w:tabs>
+          <w:tab w:val="num" w:pos="2160"/>
+        </w:tabs>
+        <w:ind w:left="2160" w:hanging="360"/>
+      </w:pPr>
+      <w:rPr>
+        <w:rFonts w:ascii="Wingdings" w:hAnsi="Wingdings" w:hint="default"/>
+        <w:sz w:val="20"/>
+      </w:rPr>
+    </w:lvl>
+    <w:lvl w:ilvl="3" w:tentative="1">
+      <w:start w:val="1"/>
+      <w:numFmt w:val="bullet"/>
+      <w:lvlText w:val=""/>
+      <w:lvlJc w:val="left"/>
+      <w:pPr>
+        <w:tabs>
+          <w:tab w:val="num" w:pos="2880"/>
+        </w:tabs>
+        <w:ind w:left="2880" w:hanging="360"/>
+      </w:pPr>
+      <w:rPr>
+        <w:rFonts w:ascii="Wingdings" w:hAnsi="Wingdings" w:hint="default"/>
+        <w:sz w:val="20"/>
+      </w:rPr>
+    </w:lvl>
+    <w:lvl w:ilvl="4" w:tentative="1">
+      <w:start w:val="1"/>
+      <w:numFmt w:val="bullet"/>
+      <w:lvlText w:val=""/>
+      <w:lvlJc w:val="left"/>
+      <w:pPr>
+        <w:tabs>
+          <w:tab w:val="num" w:pos="3600"/>
+        </w:tabs>
+        <w:ind w:left="3600" w:hanging="360"/>
+      </w:pPr>
+      <w:rPr>
+        <w:rFonts w:ascii="Wingdings" w:hAnsi="Wingdings" w:hint="default"/>
+        <w:sz w:val="20"/>
+      </w:rPr>
+    </w:lvl>
+    <w:lvl w:ilvl="5" w:tentative="1">
+      <w:start w:val="1"/>
+      <w:numFmt w:val="bullet"/>
+      <w:lvlText w:val=""/>
+      <w:lvlJc w:val="left"/>
+      <w:pPr>
+        <w:tabs>
+          <w:tab w:val="num" w:pos="4320"/>
+        </w:tabs>
+        <w:ind w:left="4320" w:hanging="360"/>
+      </w:pPr>
+      <w:rPr>
+        <w:rFonts w:ascii="Wingdings" w:hAnsi="Wingdings" w:hint="default"/>
+        <w:sz w:val="20"/>
+      </w:rPr>
+    </w:lvl>
+    <w:lvl w:ilvl="6" w:tentative="1">
+      <w:start w:val="1"/>
+      <w:numFmt w:val="bullet"/>
+      <w:lvlText w:val=""/>
+      <w:lvlJc w:val="left"/>
+      <w:pPr>
+        <w:tabs>
+          <w:tab w:val="num" w:pos="5040"/>
+        </w:tabs>
+        <w:ind w:left="5040" w:hanging="360"/>
+      </w:pPr>
+      <w:rPr>
+        <w:rFonts w:ascii="Wingdings" w:hAnsi="Wingdings" w:hint="default"/>
+        <w:sz w:val="20"/>
+      </w:rPr>
+    </w:lvl>
+    <w:lvl w:ilvl="7" w:tentative="1">
+      <w:start w:val="1"/>
+      <w:numFmt w:val="bullet"/>
+      <w:lvlText w:val=""/>
+      <w:lvlJc w:val="left"/>
+      <w:pPr>
+        <w:tabs>
+          <w:tab w:val="num" w:pos="5760"/>
+        </w:tabs>
+        <w:ind w:left="5760" w:hanging="360"/>
+      </w:pPr>
+      <w:rPr>
+        <w:rFonts w:ascii="Wingdings" w:hAnsi="Wingdings" w:hint="default"/>
+        <w:sz w:val="20"/>
+      </w:rPr>
+    </w:lvl>
+    <w:lvl w:ilvl="8" w:tentative="1">
+      <w:start w:val="1"/>
+      <w:numFmt w:val="bullet"/>
+      <w:lvlText w:val=""/>
+      <w:lvlJc w:val="left"/>
+      <w:pPr>
+        <w:tabs>
+          <w:tab w:val="num" w:pos="6480"/>
+        </w:tabs>
+        <w:ind w:left="6480" w:hanging="360"/>
+      </w:pPr>
+      <w:rPr>
+        <w:rFonts w:ascii="Wingdings" w:hAnsi="Wingdings" w:hint="default"/>
+        <w:sz w:val="20"/>
+      </w:rPr>
+    </w:lvl>
+  </w:abstractNum>
+  <w:abstractNum w:abstractNumId="39" w15:restartNumberingAfterBreak="0">
     <w:nsid w:val="77A546E9"/>
     <w:multiLevelType w:val="hybridMultilevel"/>
     <w:tmpl w:val="26248A6C"/>
@@ -12140,7 +13581,7 @@
       </w:rPr>
     </w:lvl>
   </w:abstractNum>
-  <w:abstractNum w:abstractNumId="35" w15:restartNumberingAfterBreak="0">
+  <w:abstractNum w:abstractNumId="40" w15:restartNumberingAfterBreak="0">
     <w:nsid w:val="797F46DD"/>
     <w:multiLevelType w:val="multilevel"/>
     <w:tmpl w:val="C024B2D4"/>
@@ -12289,7 +13730,7 @@
       </w:rPr>
     </w:lvl>
   </w:abstractNum>
-  <w:abstractNum w:abstractNumId="36" w15:restartNumberingAfterBreak="0">
+  <w:abstractNum w:abstractNumId="41" w15:restartNumberingAfterBreak="0">
     <w:nsid w:val="7D2B2A1F"/>
     <w:multiLevelType w:val="multilevel"/>
     <w:tmpl w:val="462A41C8"/>
@@ -12438,7 +13879,7 @@
       </w:rPr>
     </w:lvl>
   </w:abstractNum>
-  <w:abstractNum w:abstractNumId="37" w15:restartNumberingAfterBreak="0">
+  <w:abstractNum w:abstractNumId="42" w15:restartNumberingAfterBreak="0">
     <w:nsid w:val="7F1E0248"/>
     <w:multiLevelType w:val="hybridMultilevel"/>
     <w:tmpl w:val="69986B44"/>
@@ -12551,125 +13992,140 @@
       </w:rPr>
     </w:lvl>
   </w:abstractNum>
-  <w:num w:numId="1" w16cid:durableId="1829789205">
+  <w:num w:numId="1">
+    <w:abstractNumId w:val="16"/>
+  </w:num>
+  <w:num w:numId="2">
+    <w:abstractNumId w:val="2"/>
+  </w:num>
+  <w:num w:numId="3">
+    <w:abstractNumId w:val="22"/>
+  </w:num>
+  <w:num w:numId="4">
+    <w:abstractNumId w:val="0"/>
+  </w:num>
+  <w:num w:numId="5">
+    <w:abstractNumId w:val="19"/>
+  </w:num>
+  <w:num w:numId="6">
+    <w:abstractNumId w:val="17"/>
+  </w:num>
+  <w:num w:numId="7">
+    <w:abstractNumId w:val="14"/>
+  </w:num>
+  <w:num w:numId="8">
+    <w:abstractNumId w:val="39"/>
+  </w:num>
+  <w:num w:numId="9">
+    <w:abstractNumId w:val="3"/>
+  </w:num>
+  <w:num w:numId="10">
+    <w:abstractNumId w:val="26"/>
+  </w:num>
+  <w:num w:numId="11">
+    <w:abstractNumId w:val="29"/>
+  </w:num>
+  <w:num w:numId="12">
+    <w:abstractNumId w:val="15"/>
+  </w:num>
+  <w:num w:numId="13">
+    <w:abstractNumId w:val="12"/>
+  </w:num>
+  <w:num w:numId="14">
+    <w:abstractNumId w:val="30"/>
+  </w:num>
+  <w:num w:numId="15">
+    <w:abstractNumId w:val="23"/>
+  </w:num>
+  <w:num w:numId="16">
+    <w:abstractNumId w:val="7"/>
+  </w:num>
+  <w:num w:numId="17">
+    <w:abstractNumId w:val="25"/>
+  </w:num>
+  <w:num w:numId="18">
+    <w:abstractNumId w:val="5"/>
+  </w:num>
+  <w:num w:numId="19">
+    <w:abstractNumId w:val="18"/>
+  </w:num>
+  <w:num w:numId="20">
+    <w:abstractNumId w:val="31"/>
+  </w:num>
+  <w:num w:numId="21">
+    <w:abstractNumId w:val="28"/>
+  </w:num>
+  <w:num w:numId="22">
+    <w:abstractNumId w:val="37"/>
+  </w:num>
+  <w:num w:numId="23">
+    <w:abstractNumId w:val="6"/>
+  </w:num>
+  <w:num w:numId="24">
+    <w:abstractNumId w:val="36"/>
+  </w:num>
+  <w:num w:numId="25">
+    <w:abstractNumId w:val="42"/>
+  </w:num>
+  <w:num w:numId="26">
+    <w:abstractNumId w:val="27"/>
+  </w:num>
+  <w:num w:numId="27">
+    <w:abstractNumId w:val="32"/>
+  </w:num>
+  <w:num w:numId="28">
+    <w:abstractNumId w:val="10"/>
+  </w:num>
+  <w:num w:numId="29">
+    <w:abstractNumId w:val="35"/>
+  </w:num>
+  <w:num w:numId="30">
+    <w:abstractNumId w:val="8"/>
+  </w:num>
+  <w:num w:numId="31">
+    <w:abstractNumId w:val="21"/>
+  </w:num>
+  <w:num w:numId="32">
+    <w:abstractNumId w:val="33"/>
+  </w:num>
+  <w:num w:numId="33">
+    <w:abstractNumId w:val="40"/>
+  </w:num>
+  <w:num w:numId="34">
+    <w:abstractNumId w:val="9"/>
+  </w:num>
+  <w:num w:numId="35">
+    <w:abstractNumId w:val="41"/>
+  </w:num>
+  <w:num w:numId="36">
     <w:abstractNumId w:val="13"/>
   </w:num>
-  <w:num w:numId="2" w16cid:durableId="240872631">
+  <w:num w:numId="37">
+    <w:abstractNumId w:val="20"/>
+  </w:num>
+  <w:num w:numId="38">
+    <w:abstractNumId w:val="34"/>
+  </w:num>
+  <w:num w:numId="39">
+    <w:abstractNumId w:val="38"/>
+  </w:num>
+  <w:num w:numId="40">
+    <w:abstractNumId w:val="4"/>
+  </w:num>
+  <w:num w:numId="41">
+    <w:abstractNumId w:val="11"/>
+  </w:num>
+  <w:num w:numId="42">
     <w:abstractNumId w:val="1"/>
   </w:num>
-  <w:num w:numId="3" w16cid:durableId="2055502463">
-    <w:abstractNumId w:val="19"/>
-  </w:num>
-  <w:num w:numId="4" w16cid:durableId="1322274623">
-    <w:abstractNumId w:val="0"/>
-  </w:num>
-  <w:num w:numId="5" w16cid:durableId="1869952289">
-    <w:abstractNumId w:val="16"/>
-  </w:num>
-  <w:num w:numId="6" w16cid:durableId="384254081">
-    <w:abstractNumId w:val="14"/>
-  </w:num>
-  <w:num w:numId="7" w16cid:durableId="319844251">
-    <w:abstractNumId w:val="11"/>
-  </w:num>
-  <w:num w:numId="8" w16cid:durableId="748580884">
-    <w:abstractNumId w:val="34"/>
-  </w:num>
-  <w:num w:numId="9" w16cid:durableId="2058313379">
-    <w:abstractNumId w:val="2"/>
-  </w:num>
-  <w:num w:numId="10" w16cid:durableId="1775592319">
-    <w:abstractNumId w:val="22"/>
-  </w:num>
-  <w:num w:numId="11" w16cid:durableId="113213280">
-    <w:abstractNumId w:val="25"/>
-  </w:num>
-  <w:num w:numId="12" w16cid:durableId="776948208">
-    <w:abstractNumId w:val="12"/>
-  </w:num>
-  <w:num w:numId="13" w16cid:durableId="1372999266">
-    <w:abstractNumId w:val="9"/>
-  </w:num>
-  <w:num w:numId="14" w16cid:durableId="337580729">
-    <w:abstractNumId w:val="26"/>
-  </w:num>
-  <w:num w:numId="15" w16cid:durableId="1950117506">
-    <w:abstractNumId w:val="20"/>
-  </w:num>
-  <w:num w:numId="16" w16cid:durableId="212153871">
-    <w:abstractNumId w:val="5"/>
-  </w:num>
-  <w:num w:numId="17" w16cid:durableId="129328623">
-    <w:abstractNumId w:val="21"/>
-  </w:num>
-  <w:num w:numId="18" w16cid:durableId="291861892">
-    <w:abstractNumId w:val="3"/>
-  </w:num>
-  <w:num w:numId="19" w16cid:durableId="1710956462">
-    <w:abstractNumId w:val="15"/>
-  </w:num>
-  <w:num w:numId="20" w16cid:durableId="1616905891">
-    <w:abstractNumId w:val="27"/>
-  </w:num>
-  <w:num w:numId="21" w16cid:durableId="765612609">
+  <w:num w:numId="43">
     <w:abstractNumId w:val="24"/>
-  </w:num>
-  <w:num w:numId="22" w16cid:durableId="1855682847">
-    <w:abstractNumId w:val="33"/>
-  </w:num>
-  <w:num w:numId="23" w16cid:durableId="762530680">
-    <w:abstractNumId w:val="4"/>
-  </w:num>
-  <w:num w:numId="24" w16cid:durableId="458228328">
-    <w:abstractNumId w:val="32"/>
-  </w:num>
-  <w:num w:numId="25" w16cid:durableId="429619137">
-    <w:abstractNumId w:val="37"/>
-  </w:num>
-  <w:num w:numId="26" w16cid:durableId="841822122">
-    <w:abstractNumId w:val="23"/>
-  </w:num>
-  <w:num w:numId="27" w16cid:durableId="359014236">
-    <w:abstractNumId w:val="28"/>
-  </w:num>
-  <w:num w:numId="28" w16cid:durableId="1095440489">
-    <w:abstractNumId w:val="8"/>
-  </w:num>
-  <w:num w:numId="29" w16cid:durableId="1174612740">
-    <w:abstractNumId w:val="31"/>
-  </w:num>
-  <w:num w:numId="30" w16cid:durableId="148249984">
-    <w:abstractNumId w:val="6"/>
-  </w:num>
-  <w:num w:numId="31" w16cid:durableId="232467993">
-    <w:abstractNumId w:val="18"/>
-  </w:num>
-  <w:num w:numId="32" w16cid:durableId="2093818689">
-    <w:abstractNumId w:val="29"/>
-  </w:num>
-  <w:num w:numId="33" w16cid:durableId="1890339028">
-    <w:abstractNumId w:val="35"/>
-  </w:num>
-  <w:num w:numId="34" w16cid:durableId="918176435">
-    <w:abstractNumId w:val="7"/>
-  </w:num>
-  <w:num w:numId="35" w16cid:durableId="1956326443">
-    <w:abstractNumId w:val="36"/>
-  </w:num>
-  <w:num w:numId="36" w16cid:durableId="211120572">
-    <w:abstractNumId w:val="10"/>
-  </w:num>
-  <w:num w:numId="37" w16cid:durableId="1959531692">
-    <w:abstractNumId w:val="17"/>
-  </w:num>
-  <w:num w:numId="38" w16cid:durableId="859468222">
-    <w:abstractNumId w:val="30"/>
   </w:num>
 </w:numbering>
 </file>
 
 <file path=word/styles.xml><?xml version="1.0" encoding="utf-8"?>
-<w:styles xmlns:mc="http://schemas.openxmlformats.org/markup-compatibility/2006" xmlns:r="http://schemas.openxmlformats.org/officeDocument/2006/relationships" xmlns:w="http://schemas.openxmlformats.org/wordprocessingml/2006/main" xmlns:w14="http://schemas.microsoft.com/office/word/2010/wordml" xmlns:w15="http://schemas.microsoft.com/office/word/2012/wordml" xmlns:w16cex="http://schemas.microsoft.com/office/word/2018/wordml/cex" xmlns:w16cid="http://schemas.microsoft.com/office/word/2016/wordml/cid" xmlns:w16="http://schemas.microsoft.com/office/word/2018/wordml" xmlns:w16du="http://schemas.microsoft.com/office/word/2023/wordml/word16du" xmlns:w16sdtdh="http://schemas.microsoft.com/office/word/2020/wordml/sdtdatahash" xmlns:w16sdtfl="http://schemas.microsoft.com/office/word/2024/wordml/sdtformatlock" xmlns:w16se="http://schemas.microsoft.com/office/word/2015/wordml/symex" mc:Ignorable="w14 w15 w16se w16cid w16 w16cex w16sdtdh w16sdtfl w16du">
+<w:styles xmlns:mc="http://schemas.openxmlformats.org/markup-compatibility/2006" xmlns:r="http://schemas.openxmlformats.org/officeDocument/2006/relationships" xmlns:w="http://schemas.openxmlformats.org/wordprocessingml/2006/main" xmlns:w14="http://schemas.microsoft.com/office/word/2010/wordml" xmlns:w15="http://schemas.microsoft.com/office/word/2012/wordml" xmlns:w16cex="http://schemas.microsoft.com/office/word/2018/wordml/cex" xmlns:w16cid="http://schemas.microsoft.com/office/word/2016/wordml/cid" xmlns:w16="http://schemas.microsoft.com/office/word/2018/wordml" xmlns:w16sdtdh="http://schemas.microsoft.com/office/word/2020/wordml/sdtdatahash" xmlns:w16se="http://schemas.microsoft.com/office/word/2015/wordml/symex" mc:Ignorable="w14 w15 w16se w16cid w16 w16cex w16sdtdh">
   <w:docDefaults>
     <w:rPrDefault>
       <w:rPr>
@@ -13271,6 +14727,7 @@
   <w:style w:type="character" w:default="1" w:styleId="DefaultParagraphFont">
     <w:name w:val="Default Paragraph Font"/>
     <w:uiPriority w:val="1"/>
+    <w:semiHidden/>
     <w:unhideWhenUsed/>
   </w:style>
   <w:style w:type="table" w:default="1" w:styleId="TableNormal">
@@ -13678,6 +15135,58 @@
       <w:shd w:val="clear" w:color="auto" w:fill="E1DFDD"/>
     </w:rPr>
   </w:style>
+  <w:style w:type="paragraph" w:styleId="NormalWeb">
+    <w:name w:val="Normal (Web)"/>
+    <w:basedOn w:val="Normal"/>
+    <w:uiPriority w:val="99"/>
+    <w:semiHidden/>
+    <w:unhideWhenUsed/>
+    <w:rsid w:val="00DF4AA7"/>
+    <w:pPr>
+      <w:spacing w:before="100" w:beforeAutospacing="1" w:after="100" w:afterAutospacing="1" w:line="240" w:lineRule="auto"/>
+    </w:pPr>
+    <w:rPr>
+      <w:rFonts w:ascii="Times New Roman" w:eastAsia="Times New Roman" w:hAnsi="Times New Roman" w:cs="Times New Roman"/>
+      <w:kern w:val="0"/>
+      <w:lang w:val="en-US"/>
+      <w14:ligatures w14:val="none"/>
+    </w:rPr>
+  </w:style>
+  <w:style w:type="character" w:styleId="Strong">
+    <w:name w:val="Strong"/>
+    <w:basedOn w:val="DefaultParagraphFont"/>
+    <w:uiPriority w:val="22"/>
+    <w:qFormat/>
+    <w:rsid w:val="00DF4AA7"/>
+    <w:rPr>
+      <w:b/>
+      <w:bCs/>
+    </w:rPr>
+  </w:style>
+  <w:style w:type="character" w:styleId="Emphasis">
+    <w:name w:val="Emphasis"/>
+    <w:basedOn w:val="DefaultParagraphFont"/>
+    <w:uiPriority w:val="20"/>
+    <w:qFormat/>
+    <w:rsid w:val="00DF4AA7"/>
+    <w:rPr>
+      <w:i/>
+      <w:iCs/>
+    </w:rPr>
+  </w:style>
+  <w:style w:type="character" w:styleId="HTMLCode">
+    <w:name w:val="HTML Code"/>
+    <w:basedOn w:val="DefaultParagraphFont"/>
+    <w:uiPriority w:val="99"/>
+    <w:semiHidden/>
+    <w:unhideWhenUsed/>
+    <w:rsid w:val="00DF4AA7"/>
+    <w:rPr>
+      <w:rFonts w:ascii="Courier New" w:eastAsia="Times New Roman" w:hAnsi="Courier New" w:cs="Courier New"/>
+      <w:sz w:val="20"/>
+      <w:szCs w:val="20"/>
+    </w:rPr>
+  </w:style>
 </w:styles>
 </file>
 

</xml_diff>